<commit_message>
abstract, intro, II. ok
</commit_message>
<xml_diff>
--- a/02_Article/DisasterAware_IEEE.docx
+++ b/02_Article/DisasterAware_IEEE.docx
@@ -1285,7 +1285,7 @@
         <mc:AlternateContent>
           <mc:Choice Requires="wpg">
             <w:drawing>
-              <wp:anchor distT="0" distB="0" distL="114300" distR="114300" simplePos="0" relativeHeight="251656192" behindDoc="0" locked="0" layoutInCell="1" allowOverlap="1" wp14:anchorId="582B8107" wp14:editId="4444523B">
+              <wp:anchor distT="0" distB="0" distL="114300" distR="114300" simplePos="0" relativeHeight="251658240" behindDoc="0" locked="0" layoutInCell="1" allowOverlap="1" wp14:anchorId="582B8107" wp14:editId="4444523B">
                 <wp:simplePos x="0" y="0"/>
                 <wp:positionH relativeFrom="column">
                   <wp:posOffset>3374390</wp:posOffset>
@@ -1334,7 +1334,6 @@
                               <w:pPr>
                                 <w:pStyle w:val="Caption"/>
                               </w:pPr>
-                              <w:bookmarkStart w:id="2" w:name="_Ref232977215"/>
                               <w:r>
                                 <w:rPr>
                                   <w:b/>
@@ -1379,7 +1378,6 @@
                                 </w:rPr>
                                 <w:fldChar w:fldCharType="end"/>
                               </w:r>
-                              <w:bookmarkEnd w:id="2"/>
                               <w:r>
                                 <w:rPr>
                                   <w:b/>
@@ -1435,7 +1433,7 @@
           </mc:Choice>
           <mc:Fallback>
             <w:pict>
-              <v:group w14:anchorId="582B8107" id="Group 4" o:spid="_x0000_s1026" style="position:absolute;left:0;text-align:left;margin-left:265.7pt;margin-top:-.1pt;width:254.45pt;height:140.1pt;z-index:251656192;mso-height-relative:margin" coordsize="32315,17792" o:gfxdata="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">
+              <v:group w14:anchorId="582B8107" id="Group 4" o:spid="_x0000_s1026" style="position:absolute;left:0;text-align:left;margin-left:265.7pt;margin-top:-.1pt;width:254.45pt;height:140.1pt;z-index:251658240;mso-height-relative:margin" coordsize="32315,17792" o:gfxdata="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">
                 <v:shapetype id="_x0000_t202" coordsize="21600,21600" o:spt="202" path="m,l,21600r21600,l21600,xe">
                   <v:stroke joinstyle="miter"/>
                   <v:path gradientshapeok="t" o:connecttype="rect"/>
@@ -1447,7 +1445,6 @@
                         <w:pPr>
                           <w:pStyle w:val="Caption"/>
                         </w:pPr>
-                        <w:bookmarkStart w:id="3" w:name="_Ref232977215"/>
                         <w:r>
                           <w:rPr>
                             <w:b/>
@@ -1492,7 +1489,6 @@
                           </w:rPr>
                           <w:fldChar w:fldCharType="end"/>
                         </w:r>
-                        <w:bookmarkEnd w:id="3"/>
                         <w:r>
                           <w:rPr>
                             <w:b/>
@@ -2427,7 +2423,7 @@
               <w:pStyle w:val="Caption"/>
               <w:jc w:val="right"/>
             </w:pPr>
-            <w:bookmarkStart w:id="4" w:name="_Ref232971950"/>
+            <w:bookmarkStart w:id="2" w:name="_Ref232971950"/>
             <w:r>
               <w:t xml:space="preserve">( </w:t>
             </w:r>
@@ -2442,7 +2438,7 @@
             <w:r>
               <w:t xml:space="preserve"> )</w:t>
             </w:r>
-            <w:bookmarkEnd w:id="4"/>
+            <w:bookmarkEnd w:id="2"/>
           </w:p>
         </w:tc>
       </w:tr>
@@ -2785,7 +2781,7 @@
               <w:pStyle w:val="Caption"/>
               <w:jc w:val="right"/>
             </w:pPr>
-            <w:bookmarkStart w:id="5" w:name="_Ref232971942"/>
+            <w:bookmarkStart w:id="3" w:name="_Ref232971942"/>
             <w:r>
               <w:t xml:space="preserve">( </w:t>
             </w:r>
@@ -2800,7 +2796,7 @@
             <w:r>
               <w:t xml:space="preserve"> )</w:t>
             </w:r>
-            <w:bookmarkEnd w:id="5"/>
+            <w:bookmarkEnd w:id="3"/>
           </w:p>
         </w:tc>
       </w:tr>
@@ -3136,7 +3132,7 @@
               <w:pStyle w:val="Caption"/>
               <w:jc w:val="right"/>
             </w:pPr>
-            <w:bookmarkStart w:id="6" w:name="_Ref232971958"/>
+            <w:bookmarkStart w:id="4" w:name="_Ref232971958"/>
             <w:r>
               <w:t xml:space="preserve">( </w:t>
             </w:r>
@@ -3151,7 +3147,7 @@
             <w:r>
               <w:t xml:space="preserve"> )</w:t>
             </w:r>
-            <w:bookmarkEnd w:id="6"/>
+            <w:bookmarkEnd w:id="4"/>
           </w:p>
         </w:tc>
       </w:tr>
@@ -3277,7 +3273,7 @@
               <w:pStyle w:val="Caption"/>
               <w:jc w:val="right"/>
             </w:pPr>
-            <w:bookmarkStart w:id="7" w:name="_Ref232971995"/>
+            <w:bookmarkStart w:id="5" w:name="_Ref232971995"/>
             <w:r>
               <w:t xml:space="preserve">( </w:t>
             </w:r>
@@ -3292,7 +3288,7 @@
             <w:r>
               <w:t xml:space="preserve"> )</w:t>
             </w:r>
-            <w:bookmarkEnd w:id="7"/>
+            <w:bookmarkEnd w:id="5"/>
           </w:p>
         </w:tc>
       </w:tr>
@@ -3439,8 +3435,8 @@
                               <w:pPr>
                                 <w:pStyle w:val="Caption"/>
                               </w:pPr>
-                              <w:bookmarkStart w:id="8" w:name="_Ref232978231"/>
-                              <w:bookmarkStart w:id="9" w:name="_Ref232978221"/>
+                              <w:bookmarkStart w:id="6" w:name="_Ref232978231"/>
+                              <w:bookmarkStart w:id="7" w:name="_Ref232978221"/>
                               <w:r>
                                 <w:rPr>
                                   <w:b/>
@@ -3484,7 +3480,7 @@
                                 </w:rPr>
                                 <w:fldChar w:fldCharType="end"/>
                               </w:r>
-                              <w:bookmarkEnd w:id="8"/>
+                              <w:bookmarkEnd w:id="6"/>
                               <w:r>
                                 <w:rPr>
                                   <w:b/>
@@ -3495,7 +3491,7 @@
                               <w:r>
                                 <w:t xml:space="preserve"> Decision making under partial observability (top), the first candidate decision (bottom).</w:t>
                               </w:r>
-                              <w:bookmarkEnd w:id="9"/>
+                              <w:bookmarkEnd w:id="7"/>
                             </w:p>
                           </w:txbxContent>
                         </wps:txbx>
@@ -3528,8 +3524,8 @@
                         <w:pPr>
                           <w:pStyle w:val="Caption"/>
                         </w:pPr>
-                        <w:bookmarkStart w:id="10" w:name="_Ref232978231"/>
-                        <w:bookmarkStart w:id="11" w:name="_Ref232978221"/>
+                        <w:bookmarkStart w:id="8" w:name="_Ref232978231"/>
+                        <w:bookmarkStart w:id="9" w:name="_Ref232978221"/>
                         <w:r>
                           <w:rPr>
                             <w:b/>
@@ -3573,7 +3569,7 @@
                           </w:rPr>
                           <w:fldChar w:fldCharType="end"/>
                         </w:r>
-                        <w:bookmarkEnd w:id="10"/>
+                        <w:bookmarkEnd w:id="8"/>
                         <w:r>
                           <w:rPr>
                             <w:b/>
@@ -3584,7 +3580,7 @@
                         <w:r>
                           <w:t xml:space="preserve"> Decision making under partial observability (top), the first candidate decision (bottom).</w:t>
                         </w:r>
-                        <w:bookmarkEnd w:id="11"/>
+                        <w:bookmarkEnd w:id="9"/>
                       </w:p>
                     </w:txbxContent>
                   </v:textbox>
@@ -3807,7 +3803,7 @@
               <w:pStyle w:val="Caption"/>
               <w:jc w:val="right"/>
             </w:pPr>
-            <w:bookmarkStart w:id="12" w:name="_Ref232971847"/>
+            <w:bookmarkStart w:id="10" w:name="_Ref232971847"/>
             <w:r>
               <w:t xml:space="preserve">( </w:t>
             </w:r>
@@ -3822,7 +3818,7 @@
             <w:r>
               <w:t xml:space="preserve"> )</w:t>
             </w:r>
-            <w:bookmarkEnd w:id="12"/>
+            <w:bookmarkEnd w:id="10"/>
           </w:p>
         </w:tc>
       </w:tr>
@@ -4256,7 +4252,7 @@
             <w:pPr>
               <w:pStyle w:val="Caption"/>
             </w:pPr>
-            <w:bookmarkStart w:id="13" w:name="_Ref232971874"/>
+            <w:bookmarkStart w:id="11" w:name="_Ref232971874"/>
             <w:r>
               <w:t xml:space="preserve">( </w:t>
             </w:r>
@@ -4271,7 +4267,7 @@
             <w:r>
               <w:t xml:space="preserve"> )</w:t>
             </w:r>
-            <w:bookmarkEnd w:id="13"/>
+            <w:bookmarkEnd w:id="11"/>
           </w:p>
         </w:tc>
       </w:tr>
@@ -4588,7 +4584,7 @@
             <w:pPr>
               <w:pStyle w:val="Caption"/>
             </w:pPr>
-            <w:bookmarkStart w:id="14" w:name="_Ref232971864"/>
+            <w:bookmarkStart w:id="12" w:name="_Ref232971864"/>
             <w:r>
               <w:t xml:space="preserve">( </w:t>
             </w:r>
@@ -4603,7 +4599,7 @@
             <w:r>
               <w:t xml:space="preserve"> )</w:t>
             </w:r>
-            <w:bookmarkEnd w:id="14"/>
+            <w:bookmarkEnd w:id="12"/>
           </w:p>
         </w:tc>
       </w:tr>
@@ -4722,7 +4718,7 @@
                               <w:pPr>
                                 <w:pStyle w:val="Caption"/>
                               </w:pPr>
-                              <w:bookmarkStart w:id="15" w:name="_Ref232966552"/>
+                              <w:bookmarkStart w:id="13" w:name="_Ref232966552"/>
                               <w:r>
                                 <w:rPr>
                                   <w:b/>
@@ -4766,7 +4762,7 @@
                                 </w:rPr>
                                 <w:fldChar w:fldCharType="end"/>
                               </w:r>
-                              <w:bookmarkEnd w:id="15"/>
+                              <w:bookmarkEnd w:id="13"/>
                               <w:r>
                                 <w:rPr>
                                   <w:b/>
@@ -4813,7 +4809,7 @@
                         <w:pPr>
                           <w:pStyle w:val="Caption"/>
                         </w:pPr>
-                        <w:bookmarkStart w:id="16" w:name="_Ref232966552"/>
+                        <w:bookmarkStart w:id="14" w:name="_Ref232966552"/>
                         <w:r>
                           <w:rPr>
                             <w:b/>
@@ -4857,7 +4853,7 @@
                           </w:rPr>
                           <w:fldChar w:fldCharType="end"/>
                         </w:r>
-                        <w:bookmarkEnd w:id="16"/>
+                        <w:bookmarkEnd w:id="14"/>
                         <w:r>
                           <w:rPr>
                             <w:b/>
@@ -5106,7 +5102,7 @@
               <w:pStyle w:val="Caption"/>
               <w:jc w:val="right"/>
             </w:pPr>
-            <w:bookmarkStart w:id="17" w:name="_Ref232972268"/>
+            <w:bookmarkStart w:id="15" w:name="_Ref232972268"/>
             <w:r>
               <w:t xml:space="preserve">( </w:t>
             </w:r>
@@ -5121,7 +5117,7 @@
             <w:r>
               <w:t xml:space="preserve"> )</w:t>
             </w:r>
-            <w:bookmarkEnd w:id="17"/>
+            <w:bookmarkEnd w:id="15"/>
           </w:p>
         </w:tc>
       </w:tr>
@@ -5290,7 +5286,7 @@
               <w:pStyle w:val="Caption"/>
               <w:jc w:val="right"/>
             </w:pPr>
-            <w:bookmarkStart w:id="18" w:name="_Ref232972296"/>
+            <w:bookmarkStart w:id="16" w:name="_Ref232972296"/>
             <w:r>
               <w:t xml:space="preserve">( </w:t>
             </w:r>
@@ -5305,7 +5301,7 @@
             <w:r>
               <w:t xml:space="preserve"> )</w:t>
             </w:r>
-            <w:bookmarkEnd w:id="18"/>
+            <w:bookmarkEnd w:id="16"/>
           </w:p>
         </w:tc>
       </w:tr>
@@ -5406,7 +5402,7 @@
               <w:pStyle w:val="Caption"/>
               <w:jc w:val="right"/>
             </w:pPr>
-            <w:bookmarkStart w:id="19" w:name="_Ref232972322"/>
+            <w:bookmarkStart w:id="17" w:name="_Ref232972322"/>
             <w:r>
               <w:t xml:space="preserve">( </w:t>
             </w:r>
@@ -5421,7 +5417,7 @@
             <w:r>
               <w:t xml:space="preserve"> )</w:t>
             </w:r>
-            <w:bookmarkEnd w:id="19"/>
+            <w:bookmarkEnd w:id="17"/>
           </w:p>
         </w:tc>
       </w:tr>
@@ -5468,7 +5464,7 @@
           <w:b/>
           <w:bCs/>
         </w:rPr>
-        <w:t>Error! Reference source not found.</w:t>
+        <w:t>4</w:t>
       </w:r>
       <w:r>
         <w:fldChar w:fldCharType="end"/>
@@ -5561,7 +5557,6 @@
                   <w:rPr>
                     <w:rFonts w:ascii="Cambria Math" w:hAnsi="Cambria Math"/>
                   </w:rPr>
-                  <w:lastRenderedPageBreak/>
                   <m:t>τ=</m:t>
                 </m:r>
                 <m:sSub>
@@ -5695,11 +5690,11 @@
             <w:pPr>
               <w:pStyle w:val="Caption"/>
             </w:pPr>
-            <w:bookmarkStart w:id="20" w:name="eq9"/>
+            <w:bookmarkStart w:id="18" w:name="eq9"/>
             <w:r>
               <w:t>( 11 )</w:t>
             </w:r>
-            <w:bookmarkEnd w:id="20"/>
+            <w:bookmarkEnd w:id="18"/>
           </w:p>
         </w:tc>
       </w:tr>
@@ -5708,12 +5703,8 @@
       <w:pPr>
         <w:pStyle w:val="PARAIndent"/>
       </w:pPr>
-    </w:p>
-    <w:p>
-      <w:pPr>
-        <w:pStyle w:val="PARAIndent"/>
-      </w:pPr>
-      <w:r>
+      <w:r>
+        <w:lastRenderedPageBreak/>
         <w:t xml:space="preserve">A hierarchical organization </w:t>
       </w:r>
       <w:sdt>
@@ -5901,6 +5892,248 @@
       <w:pPr>
         <w:pStyle w:val="Heading1"/>
       </w:pPr>
+      <w:r>
+        <w:rPr>
+          <w:noProof/>
+        </w:rPr>
+        <mc:AlternateContent>
+          <mc:Choice Requires="wpg">
+            <w:drawing>
+              <wp:anchor distT="0" distB="0" distL="114300" distR="114300" simplePos="0" relativeHeight="251658240" behindDoc="0" locked="0" layoutInCell="1" allowOverlap="1" wp14:anchorId="582B8107" wp14:editId="4206BC50">
+                <wp:simplePos x="0" y="0"/>
+                <wp:positionH relativeFrom="column">
+                  <wp:posOffset>144145</wp:posOffset>
+                </wp:positionH>
+                <wp:positionV relativeFrom="margin">
+                  <wp:posOffset>102235</wp:posOffset>
+                </wp:positionV>
+                <wp:extent cx="3029585" cy="1752600"/>
+                <wp:effectExtent l="0" t="0" r="0" b="0"/>
+                <wp:wrapTopAndBottom/>
+                <wp:docPr id="1404038173" name="ArchFig"/>
+                <wp:cNvGraphicFramePr/>
+                <a:graphic xmlns:a="http://schemas.openxmlformats.org/drawingml/2006/main">
+                  <a:graphicData uri="http://schemas.microsoft.com/office/word/2010/wordprocessingGroup">
+                    <wpg:wgp>
+                      <wpg:cNvGrpSpPr/>
+                      <wpg:grpSpPr>
+                        <a:xfrm>
+                          <a:off x="0" y="0"/>
+                          <a:ext cx="3029585" cy="1752600"/>
+                          <a:chOff x="0" y="-76211"/>
+                          <a:chExt cx="3030339" cy="2201867"/>
+                        </a:xfrm>
+                      </wpg:grpSpPr>
+                      <wps:wsp>
+                        <wps:cNvPr id="247370723" name="Text Box 1"/>
+                        <wps:cNvSpPr txBox="1"/>
+                        <wps:spPr>
+                          <a:xfrm>
+                            <a:off x="0" y="1208596"/>
+                            <a:ext cx="3030126" cy="917060"/>
+                          </a:xfrm>
+                          <a:prstGeom prst="rect">
+                            <a:avLst/>
+                          </a:prstGeom>
+                          <a:solidFill>
+                            <a:prstClr val="white"/>
+                          </a:solidFill>
+                          <a:ln>
+                            <a:noFill/>
+                          </a:ln>
+                        </wps:spPr>
+                        <wps:txbx>
+                          <w:txbxContent>
+                            <w:p>
+                              <w:pPr>
+                                <w:pStyle w:val="Caption"/>
+                              </w:pPr>
+                              <w:bookmarkStart w:id="19" w:name="_Ref232977215"/>
+                              <w:r>
+                                <w:rPr>
+                                  <w:b/>
+                                  <w:bCs/>
+                                </w:rPr>
+                                <w:t xml:space="preserve">Fig. </w:t>
+                              </w:r>
+                              <w:bookmarkStart w:id="20" w:name="fig3"/>
+                              <w:r>
+                                <w:rPr>
+                                  <w:b/>
+                                  <w:bCs/>
+                                </w:rPr>
+                                <w:fldChar w:fldCharType="begin"/>
+                              </w:r>
+                              <w:r>
+                                <w:rPr>
+                                  <w:b/>
+                                  <w:bCs/>
+                                </w:rPr>
+                                <w:instrText xml:space="preserve"> SEQ Fig. \* ARABIC </w:instrText>
+                              </w:r>
+                              <w:r>
+                                <w:rPr>
+                                  <w:b/>
+                                  <w:bCs/>
+                                </w:rPr>
+                                <w:fldChar w:fldCharType="separate"/>
+                              </w:r>
+                              <w:r>
+                                <w:rPr>
+                                  <w:b/>
+                                  <w:bCs/>
+                                  <w:noProof/>
+                                </w:rPr>
+                                <w:t>4</w:t>
+                              </w:r>
+                              <w:r>
+                                <w:rPr>
+                                  <w:b/>
+                                  <w:bCs/>
+                                  <w:noProof/>
+                                </w:rPr>
+                                <w:fldChar w:fldCharType="end"/>
+                              </w:r>
+                              <w:bookmarkEnd w:id="19"/>
+                              <w:bookmarkEnd w:id="20"/>
+                              <w:r>
+                                <w:rPr>
+                                  <w:b/>
+                                  <w:bCs/>
+                                </w:rPr>
+                                <w:t>.</w:t>
+                              </w:r>
+                              <w:r>
+                                <w:t xml:space="preserve"> Three coordination architectures: a centralized reasoner, a peer-to-peer distributed design, and a hierarchical organization of local reasoners coordinated by a higher level.</w:t>
+                              </w:r>
+                            </w:p>
+                            <w:p/>
+                          </w:txbxContent>
+                        </wps:txbx>
+                        <wps:bodyPr rot="0" spcFirstLastPara="0" vertOverflow="overflow" horzOverflow="overflow" vert="horz" wrap="square" lIns="0" tIns="0" rIns="0" bIns="0" numCol="1" spcCol="0" rtlCol="0" fromWordArt="0" anchor="t" anchorCtr="0" forceAA="0" compatLnSpc="1">
+                          <a:prstTxWarp prst="textNoShape">
+                            <a:avLst/>
+                          </a:prstTxWarp>
+                          <a:spAutoFit/>
+                        </wps:bodyPr>
+                      </wps:wsp>
+                      <pic:pic xmlns:pic="http://schemas.openxmlformats.org/drawingml/2006/picture">
+                        <pic:nvPicPr>
+                          <pic:cNvPr id="1764623967" name="Picture 3"/>
+                          <pic:cNvPicPr>
+                            <a:picLocks noChangeAspect="1"/>
+                          </pic:cNvPicPr>
+                        </pic:nvPicPr>
+                        <pic:blipFill>
+                          <a:blip r:embed="rId17"/>
+                          <a:stretch>
+                            <a:fillRect/>
+                          </a:stretch>
+                        </pic:blipFill>
+                        <pic:spPr>
+                          <a:xfrm>
+                            <a:off x="58154" y="-76211"/>
+                            <a:ext cx="2972185" cy="1295685"/>
+                          </a:xfrm>
+                          <a:prstGeom prst="rect">
+                            <a:avLst/>
+                          </a:prstGeom>
+                        </pic:spPr>
+                      </pic:pic>
+                    </wpg:wgp>
+                  </a:graphicData>
+                </a:graphic>
+                <wp14:sizeRelH relativeFrom="margin">
+                  <wp14:pctWidth>0</wp14:pctWidth>
+                </wp14:sizeRelH>
+                <wp14:sizeRelV relativeFrom="margin">
+                  <wp14:pctHeight>0</wp14:pctHeight>
+                </wp14:sizeRelV>
+              </wp:anchor>
+            </w:drawing>
+          </mc:Choice>
+          <mc:Fallback>
+            <w:pict>
+              <v:group w14:anchorId="582B8107" id="ArchFig" o:spid="_x0000_s1035" style="position:absolute;left:0;text-align:left;margin-left:11.35pt;margin-top:8.05pt;width:238.55pt;height:138pt;z-index:251658240;mso-position-vertical-relative:margin;mso-width-relative:margin;mso-height-relative:margin" coordorigin=",-762" coordsize="30303,22018" o:gfxdata="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">
+                <v:shape id="Text Box 1" o:spid="_x0000_s1036" type="#_x0000_t202" style="position:absolute;top:12085;width:30301;height:9171;visibility:visible;mso-wrap-style:square;v-text-anchor:top" o:gfxdata="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" stroked="f">
+                  <v:textbox style="mso-fit-shape-to-text:t" inset="0,0,0,0">
+                    <w:txbxContent>
+                      <w:p>
+                        <w:pPr>
+                          <w:pStyle w:val="Caption"/>
+                        </w:pPr>
+                        <w:bookmarkStart w:id="21" w:name="_Ref232977215"/>
+                        <w:r>
+                          <w:rPr>
+                            <w:b/>
+                            <w:bCs/>
+                          </w:rPr>
+                          <w:t xml:space="preserve">Fig. </w:t>
+                        </w:r>
+                        <w:bookmarkStart w:id="22" w:name="fig3"/>
+                        <w:r>
+                          <w:rPr>
+                            <w:b/>
+                            <w:bCs/>
+                          </w:rPr>
+                          <w:fldChar w:fldCharType="begin"/>
+                        </w:r>
+                        <w:r>
+                          <w:rPr>
+                            <w:b/>
+                            <w:bCs/>
+                          </w:rPr>
+                          <w:instrText xml:space="preserve"> SEQ Fig. \* ARABIC </w:instrText>
+                        </w:r>
+                        <w:r>
+                          <w:rPr>
+                            <w:b/>
+                            <w:bCs/>
+                          </w:rPr>
+                          <w:fldChar w:fldCharType="separate"/>
+                        </w:r>
+                        <w:r>
+                          <w:rPr>
+                            <w:b/>
+                            <w:bCs/>
+                            <w:noProof/>
+                          </w:rPr>
+                          <w:t>4</w:t>
+                        </w:r>
+                        <w:r>
+                          <w:rPr>
+                            <w:b/>
+                            <w:bCs/>
+                            <w:noProof/>
+                          </w:rPr>
+                          <w:fldChar w:fldCharType="end"/>
+                        </w:r>
+                        <w:bookmarkEnd w:id="21"/>
+                        <w:bookmarkEnd w:id="22"/>
+                        <w:r>
+                          <w:rPr>
+                            <w:b/>
+                            <w:bCs/>
+                          </w:rPr>
+                          <w:t>.</w:t>
+                        </w:r>
+                        <w:r>
+                          <w:t xml:space="preserve"> Three coordination architectures: a centralized reasoner, a peer-to-peer distributed design, and a hierarchical organization of local reasoners coordinated by a higher level.</w:t>
+                        </w:r>
+                      </w:p>
+                      <w:p/>
+                    </w:txbxContent>
+                  </v:textbox>
+                </v:shape>
+                <v:shape id="Picture 3" o:spid="_x0000_s1037" type="#_x0000_t75" style="position:absolute;left:581;top:-762;width:29722;height:12956;visibility:visible;mso-wrap-style:square" o:gfxdata="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">
+                  <v:imagedata r:id="rId18" o:title=""/>
+                </v:shape>
+                <w10:wrap type="topAndBottom" anchory="margin"/>
+              </v:group>
+            </w:pict>
+          </mc:Fallback>
+        </mc:AlternateContent>
+      </w:r>
       <w:r>
         <w:t>References</w:t>
       </w:r>
@@ -6162,15 +6395,7 @@
                 <w:iCs/>
                 <w:noProof/>
               </w:rPr>
-              <w:t xml:space="preserve">Journal of </w:t>
-            </w:r>
-            <w:r>
-              <w:rPr>
-                <w:i/>
-                <w:iCs/>
-                <w:noProof/>
-              </w:rPr>
-              <w:t xml:space="preserve">Combustion, </w:t>
+              <w:t xml:space="preserve">Journal of Combustion, </w:t>
             </w:r>
             <w:r>
               <w:rPr>
@@ -6894,6 +7119,7 @@
               <w:rPr>
                 <w:noProof/>
               </w:rPr>
+              <w:lastRenderedPageBreak/>
               <w:t xml:space="preserve">[17] </w:t>
             </w:r>
           </w:p>
@@ -7094,7 +7320,6 @@
               <w:rPr>
                 <w:noProof/>
               </w:rPr>
-              <w:lastRenderedPageBreak/>
               <w:t xml:space="preserve">vol. 8, no. 3, pp. 338-353, 1965. </w:t>
             </w:r>
           </w:p>
@@ -7121,7 +7346,6 @@
               <w:rPr>
                 <w:noProof/>
               </w:rPr>
-              <w:lastRenderedPageBreak/>
               <w:t xml:space="preserve">[21] </w:t>
             </w:r>
           </w:p>
@@ -7680,7 +7904,7 @@
           <w:szCs w:val="20"/>
         </w:rPr>
         <w:drawing>
-          <wp:anchor distT="0" distB="0" distL="114300" distR="114300" simplePos="0" relativeHeight="251655680" behindDoc="0" locked="0" layoutInCell="1" allowOverlap="1" wp14:anchorId="1535A905" wp14:editId="14263AD6">
+          <wp:anchor distT="0" distB="0" distL="114300" distR="114300" simplePos="0" relativeHeight="251656192" behindDoc="0" locked="0" layoutInCell="1" allowOverlap="1" wp14:anchorId="1535A905" wp14:editId="14263AD6">
             <wp:simplePos x="0" y="0"/>
             <wp:positionH relativeFrom="column">
               <wp:align>left</wp:align>
@@ -7701,7 +7925,7 @@
                     <pic:cNvPicPr/>
                   </pic:nvPicPr>
                   <pic:blipFill>
-                    <a:blip r:embed="rId17"/>
+                    <a:blip r:embed="rId19"/>
                     <a:stretch>
                       <a:fillRect/>
                     </a:stretch>
@@ -7785,23 +8009,15 @@
         <w:t xml:space="preserve">. </w:t>
       </w:r>
       <w:r>
-        <w:t>Over the past 10 years, he has acquired extensive experience in leading multidisciplinary R&amp;D initiatives, managing national and international research collaborations, and coordinating complex technical projects across multiple organizations and consortia.</w:t>
+        <w:t xml:space="preserve">Over the past 10 years, he has acquired extensive experience in leading multidisciplinary R&amp;D initiatives, managing national and international research </w:t>
+      </w:r>
+      <w:r>
+        <w:t>collaborations, and coordinating complex technical projects across multiple organizations and consortia.</w:t>
       </w:r>
     </w:p>
     <w:p>
       <w:r>
-        <w:t xml:space="preserve">He serves as a Industrial Reviewer for TÜBİTAK (Turkish Scientific and Technical Research Council), evaluating research proposals across multiple research domains. He also performs peer review for IEEE Transactions and related journals, contributing to the quality assurance of peer-reviewed literature. Additionally, he has been a part-time lecturer at </w:t>
-      </w:r>
-      <w:proofErr w:type="spellStart"/>
-      <w:r>
-        <w:t>Atılım</w:t>
-      </w:r>
-      <w:proofErr w:type="spellEnd"/>
-      <w:r>
-        <w:t xml:space="preserve"> University. His research interests, expertise, and professional recognition reflect a strong commitment to </w:t>
-      </w:r>
-      <w:r>
-        <w:t>advancing the fields of artificial intelligence, autonomous systems, decision support technologies, and sensor fusion in both civilian and defense applications.</w:t>
+        <w:t>He serves as a Industrial Reviewer for TÜBİTAK (Turkish Scientific and Technical Research Council), evaluating research proposals across multiple research domains. He also performs peer review for IEEE Transactions and related journals, contributing to the quality assurance of peer-reviewed literature. Additionally, he has been a part-time lecturer at Atılım University. His research interests, expertise, and professional recognition reflect a strong commitment to advancing the fields of artificial intelligence, autonomous systems, decision support technologies, and sensor fusion in both civilian and defense applications.</w:t>
       </w:r>
     </w:p>
     <w:p/>
@@ -7811,7 +8027,7 @@
           <w:noProof/>
         </w:rPr>
         <w:drawing>
-          <wp:anchor distT="0" distB="0" distL="114300" distR="114300" simplePos="0" relativeHeight="251657728" behindDoc="0" locked="0" layoutInCell="1" allowOverlap="1" wp14:anchorId="493E6F11" wp14:editId="748598D0">
+          <wp:anchor distT="0" distB="0" distL="114300" distR="114300" simplePos="0" relativeHeight="251659264" behindDoc="0" locked="0" layoutInCell="1" allowOverlap="1" wp14:anchorId="493E6F11" wp14:editId="748598D0">
             <wp:simplePos x="0" y="0"/>
             <wp:positionH relativeFrom="column">
               <wp:posOffset>31377</wp:posOffset>
@@ -7832,7 +8048,7 @@
                     <pic:cNvPicPr/>
                   </pic:nvPicPr>
                   <pic:blipFill>
-                    <a:blip r:embed="rId18"/>
+                    <a:blip r:embed="rId20"/>
                     <a:stretch>
                       <a:fillRect/>
                     </a:stretch>
@@ -7874,15 +8090,7 @@
     </w:p>
     <w:p>
       <w:r>
-        <w:t>He conducted several R&amp;D projects as project leader and researcher and gave consultancy to BİLTEN (TÜBİTAK’s Research Center on Electronics and Information Technologies), 3rd Supply and Maintenance Center of Turkish Air Forces (Ankara), TÜBİTAK-</w:t>
-      </w:r>
-      <w:proofErr w:type="spellStart"/>
-      <w:r>
-        <w:t>İltaren</w:t>
-      </w:r>
-      <w:proofErr w:type="spellEnd"/>
-      <w:r>
-        <w:t xml:space="preserve">, and to ASELSAN on the topic of “real time automatic visual tracking of targets.” Now he is studying unmanned vehicles, in particular, unmanned air and underwater vehicles. </w:t>
+        <w:t xml:space="preserve">He conducted several R&amp;D projects as project leader and researcher and gave consultancy to BİLTEN (TÜBİTAK’s Research Center on Electronics and Information Technologies), 3rd Supply and Maintenance Center of Turkish Air Forces (Ankara), TÜBİTAK-İltaren, and to ASELSAN on the topic of “real time automatic visual tracking of targets.” Now he is studying unmanned vehicles, in particular, unmanned air and underwater vehicles. </w:t>
       </w:r>
     </w:p>
     <w:p>
@@ -12958,7 +13166,7 @@
 </file>
 
 <file path=customXml/itemProps1.xml><?xml version="1.0" encoding="utf-8"?>
-<ds:datastoreItem xmlns:ds="http://schemas.openxmlformats.org/officeDocument/2006/customXml" ds:itemID="{CEAA7F9F-263B-4533-B5CF-6CD147B69412}">
+<ds:datastoreItem xmlns:ds="http://schemas.openxmlformats.org/officeDocument/2006/customXml" ds:itemID="{4B165DDB-BB4C-4DAF-8EBD-2CE2ECB1931D}">
   <ds:schemaRefs>
     <ds:schemaRef ds:uri="http://schemas.openxmlformats.org/officeDocument/2006/bibliography"/>
   </ds:schemaRefs>
@@ -12974,7 +13182,7 @@
 </file>
 
 <file path=customXml/itemProps3.xml><?xml version="1.0" encoding="utf-8"?>
-<ds:datastoreItem xmlns:ds="http://schemas.openxmlformats.org/officeDocument/2006/customXml" ds:itemID="{4B165DDB-BB4C-4DAF-8EBD-2CE2ECB1931D}">
+<ds:datastoreItem xmlns:ds="http://schemas.openxmlformats.org/officeDocument/2006/customXml" ds:itemID="{CEAA7F9F-263B-4533-B5CF-6CD147B69412}">
   <ds:schemaRefs>
     <ds:schemaRef ds:uri="http://schemas.openxmlformats.org/officeDocument/2006/bibliography"/>
   </ds:schemaRefs>

</xml_diff>

<commit_message>
III.A ok notation ok.
</commit_message>
<xml_diff>
--- a/02_Article/DisasterAware_IEEE.docx
+++ b/02_Article/DisasterAware_IEEE.docx
@@ -1285,7 +1285,7 @@
         <mc:AlternateContent>
           <mc:Choice Requires="wpg">
             <w:drawing>
-              <wp:anchor distT="0" distB="0" distL="114300" distR="114300" simplePos="0" relativeHeight="251653632" behindDoc="0" locked="0" layoutInCell="1" allowOverlap="1" wp14:anchorId="582B8107" wp14:editId="4444523B">
+              <wp:anchor distT="0" distB="0" distL="114300" distR="114300" simplePos="0" relativeHeight="251657728" behindDoc="0" locked="0" layoutInCell="1" allowOverlap="1" wp14:anchorId="582B8107" wp14:editId="4444523B">
                 <wp:simplePos x="0" y="0"/>
                 <wp:positionH relativeFrom="column">
                   <wp:posOffset>3374390</wp:posOffset>
@@ -1433,7 +1433,7 @@
           </mc:Choice>
           <mc:Fallback>
             <w:pict>
-              <v:group w14:anchorId="582B8107" id="Group 4" o:spid="_x0000_s1026" style="position:absolute;left:0;text-align:left;margin-left:265.7pt;margin-top:-.1pt;width:254.45pt;height:140.1pt;z-index:251653632;mso-height-relative:margin" coordsize="32315,17792" o:gfxdata="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">
+              <v:group w14:anchorId="582B8107" id="Group 4" o:spid="_x0000_s1026" style="position:absolute;left:0;text-align:left;margin-left:265.7pt;margin-top:-.1pt;width:254.45pt;height:140.1pt;z-index:251657728;mso-height-relative:margin" coordsize="32315,17792" o:gfxdata="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">
                 <v:shapetype id="_x0000_t202" coordsize="21600,21600" o:spt="202" path="m,l,21600r21600,l21600,xe">
                   <v:stroke joinstyle="miter"/>
                   <v:path gradientshapeok="t" o:connecttype="rect"/>
@@ -3381,25 +3381,28 @@
         <w:t xml:space="preserve"> this growth by chaining low-</w:t>
       </w:r>
       <w:r>
+        <w:lastRenderedPageBreak/>
+        <w:t xml:space="preserve">dimensional rule blocks, but the intermediate variables they </w:t>
+      </w:r>
+      <w:r>
         <w:rPr>
           <w:noProof/>
         </w:rPr>
-        <w:lastRenderedPageBreak/>
         <mc:AlternateContent>
           <mc:Choice Requires="wpg">
             <w:drawing>
-              <wp:anchor distT="0" distB="0" distL="114300" distR="114300" simplePos="0" relativeHeight="251671040" behindDoc="0" locked="0" layoutInCell="1" allowOverlap="1" wp14:anchorId="5473CF6E" wp14:editId="0C138637">
+              <wp:anchor distT="0" distB="0" distL="114300" distR="114300" simplePos="0" relativeHeight="251653632" behindDoc="0" locked="0" layoutInCell="1" allowOverlap="1" wp14:anchorId="3B4251C2" wp14:editId="349E8576">
                 <wp:simplePos x="0" y="0"/>
                 <wp:positionH relativeFrom="column">
-                  <wp:posOffset>3373755</wp:posOffset>
+                  <wp:posOffset>35032</wp:posOffset>
                 </wp:positionH>
                 <wp:positionV relativeFrom="paragraph">
-                  <wp:posOffset>2540</wp:posOffset>
+                  <wp:posOffset>53488</wp:posOffset>
                 </wp:positionV>
-                <wp:extent cx="3217545" cy="2290445"/>
-                <wp:effectExtent l="0" t="0" r="1905" b="0"/>
+                <wp:extent cx="3120390" cy="1776730"/>
+                <wp:effectExtent l="0" t="0" r="3810" b="0"/>
                 <wp:wrapTopAndBottom/>
-                <wp:docPr id="638460422" name="Group 4"/>
+                <wp:docPr id="1009234925" name="Group 3"/>
                 <wp:cNvGraphicFramePr/>
                 <a:graphic xmlns:a="http://schemas.openxmlformats.org/drawingml/2006/main">
                   <a:graphicData uri="http://schemas.microsoft.com/office/word/2010/wordprocessingGroup">
@@ -3408,35 +3411,29 @@
                       <wpg:grpSpPr>
                         <a:xfrm>
                           <a:off x="0" y="0"/>
-                          <a:ext cx="3217545" cy="2290445"/>
-                          <a:chOff x="0" y="-1"/>
-                          <a:chExt cx="3217545" cy="2290494"/>
+                          <a:ext cx="3120390" cy="1776730"/>
+                          <a:chOff x="-57150" y="45720"/>
+                          <a:chExt cx="3120390" cy="1776730"/>
                         </a:xfrm>
                       </wpg:grpSpPr>
                       <pic:pic xmlns:pic="http://schemas.openxmlformats.org/drawingml/2006/picture">
                         <pic:nvPicPr>
-                          <pic:cNvPr id="711833605" name="Picture 3"/>
+                          <pic:cNvPr id="703359973" name="Picture 1576516411"/>
                           <pic:cNvPicPr>
                             <a:picLocks noChangeAspect="1"/>
                           </pic:cNvPicPr>
                         </pic:nvPicPr>
-                        <pic:blipFill>
-                          <a:blip r:embed="rId13" cstate="print">
-                            <a:extLst>
-                              <a:ext uri="{28A0092B-C50C-407E-A947-70E740481C1C}">
-                                <a14:useLocalDpi xmlns:a14="http://schemas.microsoft.com/office/drawing/2010/main" val="0"/>
-                              </a:ext>
-                            </a:extLst>
-                          </a:blip>
-                          <a:srcRect/>
+                        <pic:blipFill rotWithShape="1">
+                          <a:blip r:embed="rId13"/>
+                          <a:srcRect t="4121" b="5493"/>
                           <a:stretch>
                             <a:fillRect/>
                           </a:stretch>
                         </pic:blipFill>
-                        <pic:spPr bwMode="auto">
+                        <pic:spPr>
                           <a:xfrm>
-                            <a:off x="278347" y="-1"/>
-                            <a:ext cx="2680879" cy="2016369"/>
+                            <a:off x="0" y="45720"/>
+                            <a:ext cx="3063240" cy="1337310"/>
                           </a:xfrm>
                           <a:prstGeom prst="rect">
                             <a:avLst/>
@@ -3444,12 +3441,12 @@
                         </pic:spPr>
                       </pic:pic>
                       <wps:wsp>
-                        <wps:cNvPr id="2146317878" name="Text Box 1"/>
+                        <wps:cNvPr id="1971086079" name="Text Box 1"/>
                         <wps:cNvSpPr txBox="1"/>
                         <wps:spPr>
                           <a:xfrm>
-                            <a:off x="0" y="1998393"/>
-                            <a:ext cx="3217545" cy="292100"/>
+                            <a:off x="-57150" y="1384300"/>
+                            <a:ext cx="3120390" cy="438150"/>
                           </a:xfrm>
                           <a:prstGeom prst="rect">
                             <a:avLst/>
@@ -3467,8 +3464,7 @@
                               <w:pPr>
                                 <w:pStyle w:val="Caption"/>
                               </w:pPr>
-                              <w:bookmarkStart w:id="6" w:name="_Ref232978231"/>
-                              <w:bookmarkStart w:id="7" w:name="_Ref232978221"/>
+                              <w:bookmarkStart w:id="6" w:name="_Ref232966552"/>
                               <w:r>
                                 <w:rPr>
                                   <w:b/>
@@ -3521,10 +3517,10 @@
                                 <w:t>.</w:t>
                               </w:r>
                               <w:r>
-                                <w:t xml:space="preserve"> Decision making under partial observability (top), the first candidate decision (bottom).</w:t>
+                                <w:t xml:space="preserve"> Closed (finite) decision space versus an open (continuous) decision space.</w:t>
                               </w:r>
-                              <w:bookmarkEnd w:id="7"/>
                             </w:p>
+                            <w:p/>
                           </w:txbxContent>
                         </wps:txbx>
                         <wps:bodyPr rot="0" spcFirstLastPara="0" vertOverflow="overflow" horzOverflow="overflow" vert="horz" wrap="square" lIns="0" tIns="0" rIns="0" bIns="0" numCol="1" spcCol="0" rtlCol="0" fromWordArt="0" anchor="t" anchorCtr="0" forceAA="0" compatLnSpc="1">
@@ -3537,6 +3533,9 @@
                     </wpg:wgp>
                   </a:graphicData>
                 </a:graphic>
+                <wp14:sizeRelH relativeFrom="margin">
+                  <wp14:pctWidth>0</wp14:pctWidth>
+                </wp14:sizeRelH>
                 <wp14:sizeRelV relativeFrom="margin">
                   <wp14:pctHeight>0</wp14:pctHeight>
                 </wp14:sizeRelV>
@@ -3545,19 +3544,18 @@
           </mc:Choice>
           <mc:Fallback>
             <w:pict>
-              <v:group w14:anchorId="5473CF6E" id="_x0000_s1029" style="position:absolute;left:0;text-align:left;margin-left:265.65pt;margin-top:.2pt;width:253.35pt;height:180.35pt;z-index:251671040;mso-height-relative:margin" coordorigin="" coordsize="32175,22904" o:gfxdata="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">
-                <v:shape id="Picture 3" o:spid="_x0000_s1030" type="#_x0000_t75" style="position:absolute;left:2783;width:26809;height:20163;visibility:visible;mso-wrap-style:square" o:gfxdata="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">
-                  <v:imagedata r:id="rId14" o:title=""/>
+              <v:group w14:anchorId="3B4251C2" id="Group 3" o:spid="_x0000_s1029" style="position:absolute;left:0;text-align:left;margin-left:2.75pt;margin-top:4.2pt;width:245.7pt;height:139.9pt;z-index:251653632;mso-width-relative:margin;mso-height-relative:margin" coordorigin="-571,457" coordsize="31203,17767" o:gfxdata="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">
+                <v:shape id="Picture 1576516411" o:spid="_x0000_s1030" type="#_x0000_t75" style="position:absolute;top:457;width:30632;height:13373;visibility:visible;mso-wrap-style:square" o:gfxdata="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">
+                  <v:imagedata r:id="rId14" o:title="" croptop="2701f" cropbottom="3600f"/>
                 </v:shape>
-                <v:shape id="_x0000_s1031" type="#_x0000_t202" style="position:absolute;top:19983;width:32175;height:2921;visibility:visible;mso-wrap-style:square;v-text-anchor:top" o:gfxdata="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" stroked="f">
+                <v:shape id="_x0000_s1031" type="#_x0000_t202" style="position:absolute;left:-571;top:13843;width:31203;height:4381;visibility:visible;mso-wrap-style:square;v-text-anchor:top" o:gfxdata="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" stroked="f">
                   <v:textbox style="mso-fit-shape-to-text:t" inset="0,0,0,0">
                     <w:txbxContent>
                       <w:p>
                         <w:pPr>
                           <w:pStyle w:val="Caption"/>
                         </w:pPr>
-                        <w:bookmarkStart w:id="8" w:name="_Ref232978231"/>
-                        <w:bookmarkStart w:id="9" w:name="_Ref232978221"/>
+                        <w:bookmarkStart w:id="7" w:name="_Ref232966552"/>
                         <w:r>
                           <w:rPr>
                             <w:b/>
@@ -3601,7 +3599,7 @@
                           </w:rPr>
                           <w:fldChar w:fldCharType="end"/>
                         </w:r>
-                        <w:bookmarkEnd w:id="8"/>
+                        <w:bookmarkEnd w:id="7"/>
                         <w:r>
                           <w:rPr>
                             <w:b/>
@@ -3610,10 +3608,10 @@
                           <w:t>.</w:t>
                         </w:r>
                         <w:r>
-                          <w:t xml:space="preserve"> Decision making under partial observability (top), the first candidate decision (bottom).</w:t>
+                          <w:t xml:space="preserve"> Closed (finite) decision space versus an open (continuous) decision space.</w:t>
                         </w:r>
-                        <w:bookmarkEnd w:id="9"/>
                       </w:p>
+                      <w:p/>
                     </w:txbxContent>
                   </v:textbox>
                 </v:shape>
@@ -3624,7 +3622,7 @@
         </mc:AlternateContent>
       </w:r>
       <w:r>
-        <w:t>dimensional rule blocks, but the intermediate variables they introduce are often abstract and weaken the interpretability that motivates fuzzy reasoning in the first place. Reducing rule-</w:t>
+        <w:t>introduce are often abstract and weaken the interpretability that motivates fuzzy reasoning in the first place. Reducing rule-</w:t>
       </w:r>
       <w:proofErr w:type="gramStart"/>
       <w:r>
@@ -3648,10 +3646,7 @@
         <w:pStyle w:val="PARAIndent"/>
       </w:pPr>
       <w:r>
-        <w:t>How the decision itself is represented is a design choice with direct consequences. Classical decision support fixes in advance a finite catalogue 𝒜 of L candidate actions, drawn from an underlying continuous action space Ω ⊆ ℝᵈ (so 𝒜 ⊂ Ω and |𝒜| = L &lt; ∞), and returns the best entry under a scalar objective J, as in</w:t>
-      </w:r>
-      <w:r>
-        <w:t xml:space="preserve"> </w:t>
+        <w:t xml:space="preserve">How the decision itself is represented is a design choice with direct consequences. Classical decision support fixes in advance a finite catalogue 𝒟 of M candidate actions, drawn from an underlying continuous action space 𝒞 ⊆ ℝᵈ (so 𝒟 ⊂ 𝒞 and |𝒟| = M &lt; ∞), and returns the best entry under a scalar objective J, as in </w:t>
       </w:r>
       <w:r>
         <w:fldChar w:fldCharType="begin"/>
@@ -3739,7 +3734,7 @@
                       <w:rPr>
                         <w:rFonts w:ascii="Cambria Math" w:hAnsi="Cambria Math"/>
                       </w:rPr>
-                      <m:t>A</m:t>
+                      <m:t>D</m:t>
                     </m:r>
                   </m:sub>
                   <m:sup>
@@ -3794,7 +3789,7 @@
                       <w:rPr>
                         <w:rFonts w:ascii="Cambria Math" w:hAnsi="Cambria Math"/>
                       </w:rPr>
-                      <m:t>A</m:t>
+                      <m:t>D</m:t>
                     </m:r>
                   </m:lim>
                 </m:limLow>
@@ -3821,13 +3816,13 @@
                   <w:rPr>
                     <w:rFonts w:ascii="Cambria Math" w:hAnsi="Cambria Math"/>
                   </w:rPr>
-                  <m:t>A</m:t>
+                  <m:t>D</m:t>
                 </m:r>
                 <m:r>
                   <w:rPr>
                     <w:rFonts w:ascii="Cambria Math" w:hAnsi="Cambria Math"/>
                   </w:rPr>
-                  <m:t>|=L&lt;∞</m:t>
+                  <m:t>|=M&lt;∞</m:t>
                 </m:r>
               </m:oMath>
             </m:oMathPara>
@@ -3843,22 +3838,35 @@
               <w:pStyle w:val="Caption"/>
               <w:jc w:val="right"/>
             </w:pPr>
-            <w:bookmarkStart w:id="10" w:name="_Ref232971847"/>
+            <w:bookmarkStart w:id="8" w:name="_Ref232971847"/>
             <w:r>
               <w:t xml:space="preserve">( </w:t>
             </w:r>
-            <w:fldSimple w:instr=" SEQ ( \* ARABIC ">
-              <w:r>
-                <w:rPr>
-                  <w:noProof/>
-                </w:rPr>
-                <w:t>5</w:t>
-              </w:r>
-            </w:fldSimple>
+            <w:r>
+              <w:fldChar w:fldCharType="begin"/>
+            </w:r>
+            <w:r>
+              <w:instrText xml:space="preserve"> SEQ ( \* ARABIC </w:instrText>
+            </w:r>
+            <w:r>
+              <w:fldChar w:fldCharType="separate"/>
+            </w:r>
+            <w:r>
+              <w:rPr>
+                <w:noProof/>
+              </w:rPr>
+              <w:t>5</w:t>
+            </w:r>
+            <w:r>
+              <w:rPr>
+                <w:noProof/>
+              </w:rPr>
+              <w:fldChar w:fldCharType="end"/>
+            </w:r>
             <w:r>
               <w:t xml:space="preserve"> )</w:t>
             </w:r>
-            <w:bookmarkEnd w:id="10"/>
+            <w:bookmarkEnd w:id="8"/>
           </w:p>
         </w:tc>
       </w:tr>
@@ -3945,23 +3953,26 @@
         </m:r>
       </m:oMath>
       <w:r>
-        <w:t xml:space="preserve"> by a weighted aggregation of criteria but still </w:t>
-      </w:r>
-      <w:r>
-        <w:t>optimize</w:t>
-      </w:r>
-      <w:r>
-        <w:t xml:space="preserve"> over the same finite 𝒜. Two limitations follow at once: the attainable objective is capped at the best listed entry, and 𝒜 is a zero-dimensional, measure-zero subset of the continuum </w:t>
+        <w:t xml:space="preserve"> by a weighted aggregation of criteria but still optimize over the same </w:t>
+      </w:r>
+      <w:proofErr w:type="gramStart"/>
+      <w:r>
+        <w:t>finite 𝒟</w:t>
+      </w:r>
+      <w:proofErr w:type="gramEnd"/>
+      <w:r>
+        <w:t xml:space="preserve">. Two limitations follow at once: the attainable objective is capped at the best listed entry, and 𝒟 is a zero-dimensional, measure-zero subset of the continuum </w:t>
       </w:r>
       <m:oMath>
         <m:r>
           <m:rPr>
+            <m:scr m:val="script"/>
             <m:sty m:val="p"/>
           </m:rPr>
           <w:rPr>
             <w:rFonts w:ascii="Cambria Math" w:hAnsi="Cambria Math"/>
           </w:rPr>
-          <m:t>Ω</m:t>
+          <m:t>C</m:t>
         </m:r>
       </m:oMath>
       <w:r>
@@ -3971,10 +3982,7 @@
         <w:fldChar w:fldCharType="begin"/>
       </w:r>
       <w:r>
-        <w:instrText xml:space="preserve"> REF _Ref232966552 \h </w:instrText>
-      </w:r>
-      <w:r>
-        <w:instrText xml:space="preserve"> \* MERGEFORMAT </w:instrText>
+        <w:instrText xml:space="preserve"> REF _Ref232966552 \h  \* MERGEFORMAT </w:instrText>
       </w:r>
       <w:r>
         <w:fldChar w:fldCharType="separate"/>
@@ -3986,7 +3994,7 @@
         <w:rPr>
           <w:noProof/>
         </w:rPr>
-        <w:t>3</w:t>
+        <w:t>2</w:t>
       </w:r>
       <w:r>
         <w:fldChar w:fldCharType="end"/>
@@ -4000,26 +4008,18 @@
         <w:pStyle w:val="PARAIndent"/>
       </w:pPr>
       <w:r>
-        <w:t xml:space="preserve">On the other </w:t>
-      </w:r>
-      <w:r>
-        <w:t>hand,</w:t>
-      </w:r>
-      <w:r>
-        <w:t xml:space="preserve"> a</w:t>
-      </w:r>
-      <w:r>
-        <w:t xml:space="preserve">n open decision space removes the catalogue. The action ranges over the connected, compact region </w:t>
+        <w:t xml:space="preserve">On the other hand, an open decision space removes the catalogue. The action ranges over the connected, compact region </w:t>
       </w:r>
       <m:oMath>
         <m:r>
           <m:rPr>
+            <m:scr m:val="script"/>
             <m:sty m:val="p"/>
           </m:rPr>
           <w:rPr>
             <w:rFonts w:ascii="Cambria Math" w:hAnsi="Cambria Math"/>
           </w:rPr>
-          <m:t>Ω</m:t>
+          <m:t>C</m:t>
         </m:r>
         <m:r>
           <w:rPr>
@@ -4058,19 +4058,13 @@
         </m:sSup>
       </m:oMath>
       <w:r>
-        <w:t xml:space="preserve"> of positive Lebesgue measure, and the decision solves the continuous program in</w:t>
-      </w:r>
-      <w:r>
-        <w:t xml:space="preserve"> </w:t>
+        <w:t xml:space="preserve"> of positive Lebesgue measure, and the decision solves the continuous program in </w:t>
       </w:r>
       <w:r>
         <w:fldChar w:fldCharType="begin"/>
       </w:r>
       <w:r>
-        <w:instrText xml:space="preserve"> REF _Ref232971874 \h </w:instrText>
-      </w:r>
-      <w:r>
-        <w:instrText xml:space="preserve"> \* MERGEFORMAT </w:instrText>
+        <w:instrText xml:space="preserve"> REF _Ref232971874 \h  \* MERGEFORMAT </w:instrText>
       </w:r>
       <w:r>
         <w:fldChar w:fldCharType="separate"/>
@@ -4091,23 +4085,18 @@
         <w:fldChar w:fldCharType="end"/>
       </w:r>
       <w:r>
-        <w:t xml:space="preserve">, </w:t>
-      </w:r>
-      <w:r>
-        <w:t>synthesizing</w:t>
-      </w:r>
-      <w:r>
-        <w:t xml:space="preserve"> an intervention at an arbitrary point of </w:t>
+        <w:t xml:space="preserve">, synthesizing an intervention at an arbitrary point of </w:t>
       </w:r>
       <m:oMath>
         <m:r>
           <m:rPr>
+            <m:scr m:val="script"/>
             <m:sty m:val="p"/>
           </m:rPr>
           <w:rPr>
             <w:rFonts w:ascii="Cambria Math" w:hAnsi="Cambria Math"/>
           </w:rPr>
-          <m:t>Ω</m:t>
+          <m:t>C</m:t>
         </m:r>
       </m:oMath>
       <w:r>
@@ -4117,10 +4106,7 @@
         <w:fldChar w:fldCharType="begin"/>
       </w:r>
       <w:r>
-        <w:instrText xml:space="preserve"> REF _Ref232966552 \h </w:instrText>
-      </w:r>
-      <w:r>
-        <w:instrText xml:space="preserve"> \* MERGEFORMAT </w:instrText>
+        <w:instrText xml:space="preserve"> REF _Ref232966552 \h  \* MERGEFORMAT </w:instrText>
       </w:r>
       <w:r>
         <w:fldChar w:fldCharType="separate"/>
@@ -4132,7 +4118,7 @@
         <w:rPr>
           <w:noProof/>
         </w:rPr>
-        <w:t>3</w:t>
+        <w:t>2</w:t>
       </w:r>
       <w:r>
         <w:fldChar w:fldCharType="end"/>
@@ -4192,10 +4178,13 @@
                   </m:e>
                   <m:sub>
                     <m:r>
+                      <m:rPr>
+                        <m:scr m:val="script"/>
+                      </m:rPr>
                       <w:rPr>
                         <w:rFonts w:ascii="Cambria Math" w:hAnsi="Cambria Math"/>
                       </w:rPr>
-                      <m:t>Ω</m:t>
+                      <m:t>C</m:t>
                     </m:r>
                   </m:sub>
                   <m:sup>
@@ -4240,7 +4229,16 @@
                       <w:rPr>
                         <w:rFonts w:ascii="Cambria Math" w:hAnsi="Cambria Math"/>
                       </w:rPr>
-                      <m:t>a∈Ω</m:t>
+                      <m:t>a∈</m:t>
+                    </m:r>
+                    <m:r>
+                      <m:rPr>
+                        <m:scr m:val="script"/>
+                      </m:rPr>
+                      <w:rPr>
+                        <w:rFonts w:ascii="Cambria Math" w:hAnsi="Cambria Math"/>
+                      </w:rPr>
+                      <m:t>C</m:t>
                     </m:r>
                   </m:lim>
                 </m:limLow>
@@ -4248,7 +4246,16 @@
                   <w:rPr>
                     <w:rFonts w:ascii="Cambria Math" w:hAnsi="Cambria Math"/>
                   </w:rPr>
-                  <m:t xml:space="preserve"> J(a), Ω⊆</m:t>
+                  <m:t xml:space="preserve"> J(a), </m:t>
+                </m:r>
+                <m:r>
+                  <m:rPr>
+                    <m:scr m:val="script"/>
+                  </m:rPr>
+                  <w:rPr>
+                    <w:rFonts w:ascii="Cambria Math" w:hAnsi="Cambria Math"/>
+                  </w:rPr>
+                  <m:t>C⊆</m:t>
                 </m:r>
                 <m:sSup>
                   <m:sSupPr>
@@ -4292,22 +4299,35 @@
             <w:pPr>
               <w:pStyle w:val="Caption"/>
             </w:pPr>
-            <w:bookmarkStart w:id="11" w:name="_Ref232971874"/>
+            <w:bookmarkStart w:id="9" w:name="_Ref232971874"/>
             <w:r>
               <w:t xml:space="preserve">( </w:t>
             </w:r>
-            <w:fldSimple w:instr=" SEQ ( \* ARABIC ">
-              <w:r>
-                <w:rPr>
-                  <w:noProof/>
-                </w:rPr>
-                <w:t>6</w:t>
-              </w:r>
-            </w:fldSimple>
+            <w:r>
+              <w:fldChar w:fldCharType="begin"/>
+            </w:r>
+            <w:r>
+              <w:instrText xml:space="preserve"> SEQ ( \* ARABIC </w:instrText>
+            </w:r>
+            <w:r>
+              <w:fldChar w:fldCharType="separate"/>
+            </w:r>
+            <w:r>
+              <w:rPr>
+                <w:noProof/>
+              </w:rPr>
+              <w:t>6</w:t>
+            </w:r>
+            <w:r>
+              <w:rPr>
+                <w:noProof/>
+              </w:rPr>
+              <w:fldChar w:fldCharType="end"/>
+            </w:r>
             <w:r>
               <w:t xml:space="preserve"> )</w:t>
             </w:r>
-            <w:bookmarkEnd w:id="11"/>
+            <w:bookmarkEnd w:id="9"/>
           </w:p>
         </w:tc>
       </w:tr>
@@ -4322,22 +4342,7 @@
         <w:pStyle w:val="PARAIndent"/>
       </w:pPr>
       <w:r>
-        <w:t>T</w:t>
-      </w:r>
-      <w:r>
-        <w:t xml:space="preserve">he finite </w:t>
-      </w:r>
-      <w:r>
-        <w:t>catalogue</w:t>
-      </w:r>
-      <w:r>
-        <w:t xml:space="preserve"> </w:t>
-      </w:r>
-      <w:r>
-        <w:t xml:space="preserve">is </w:t>
-      </w:r>
-      <w:r>
-        <w:t xml:space="preserve">contained in the continuum, </w:t>
+        <w:t xml:space="preserve">The finite catalogue is contained in the continuum, </w:t>
       </w:r>
       <m:oMath>
         <m:r>
@@ -4347,23 +4352,29 @@
           <w:rPr>
             <w:rFonts w:ascii="Cambria Math" w:hAnsi="Cambria Math"/>
           </w:rPr>
-          <m:t>A ⊆</m:t>
+          <m:t>D ⊆</m:t>
         </m:r>
         <m:r>
           <m:rPr>
+            <m:scr m:val="script"/>
             <m:sty m:val="p"/>
           </m:rPr>
           <w:rPr>
             <w:rFonts w:ascii="Cambria Math" w:hAnsi="Cambria Math"/>
           </w:rPr>
-          <m:t>Ω</m:t>
+          <m:t>C</m:t>
         </m:r>
       </m:oMath>
       <w:r>
-        <w:t>; hence,</w:t>
-      </w:r>
-      <w:r>
-        <w:t xml:space="preserve"> the continuous optimum can never be worse than the discrete one and the discretisation gap is non-negative; moreover, when </w:t>
+        <w:t xml:space="preserve">; hence, the continuous optimum can never be worse than the discrete one and the </w:t>
+      </w:r>
+      <w:proofErr w:type="spellStart"/>
+      <w:r>
+        <w:t>discretisation</w:t>
+      </w:r>
+      <w:proofErr w:type="spellEnd"/>
+      <w:r>
+        <w:t xml:space="preserve"> gap is non-negative; moreover, when </w:t>
       </w:r>
       <m:oMath>
         <m:r>
@@ -4388,10 +4399,7 @@
         </m:r>
       </m:oMath>
       <w:r>
-        <w:t>-</w:t>
-      </w:r>
-      <w:r>
-        <w:t xml:space="preserve">Lipschitz </w:t>
+        <w:t xml:space="preserve">-Lipschitz </w:t>
       </w:r>
       <w:sdt>
         <w:sdtPr>
@@ -4420,13 +4428,15 @@
         </w:sdtContent>
       </w:sdt>
       <w:r>
-        <w:t xml:space="preserve"> </w:t>
-      </w:r>
-      <w:r>
-        <w:t>and 𝒜 is ε-dense in Ω, that gap is bounded above</w:t>
-      </w:r>
-      <w:r>
-        <w:t xml:space="preserve"> </w:t>
+        <w:t xml:space="preserve"> and 𝒟 is δ-dense </w:t>
+      </w:r>
+      <w:proofErr w:type="gramStart"/>
+      <w:r>
+        <w:t>in 𝒞</w:t>
+      </w:r>
+      <w:proofErr w:type="gramEnd"/>
+      <w:r>
+        <w:t xml:space="preserve">, that gap is bounded above </w:t>
       </w:r>
       <w:r>
         <w:fldChar w:fldCharType="begin"/>
@@ -4513,10 +4523,13 @@
                   </m:e>
                   <m:sub>
                     <m:r>
+                      <m:rPr>
+                        <m:scr m:val="script"/>
+                      </m:rPr>
                       <w:rPr>
                         <w:rFonts w:ascii="Cambria Math" w:hAnsi="Cambria Math"/>
                       </w:rPr>
-                      <m:t>Ω</m:t>
+                      <m:t>C</m:t>
                     </m:r>
                   </m:sub>
                   <m:sup>
@@ -4559,7 +4572,7 @@
                       <w:rPr>
                         <w:rFonts w:ascii="Cambria Math" w:hAnsi="Cambria Math"/>
                       </w:rPr>
-                      <m:t>A</m:t>
+                      <m:t>D</m:t>
                     </m:r>
                   </m:sub>
                   <m:sup>
@@ -4609,7 +4622,7 @@
                   <w:rPr>
                     <w:rFonts w:ascii="Cambria Math" w:hAnsi="Cambria Math"/>
                   </w:rPr>
-                  <m:t> ε</m:t>
+                  <m:t> δ</m:t>
                 </m:r>
               </m:oMath>
             </m:oMathPara>
@@ -4624,22 +4637,35 @@
             <w:pPr>
               <w:pStyle w:val="Caption"/>
             </w:pPr>
-            <w:bookmarkStart w:id="12" w:name="_Ref232971864"/>
+            <w:bookmarkStart w:id="10" w:name="_Ref232971864"/>
             <w:r>
               <w:t xml:space="preserve">( </w:t>
             </w:r>
-            <w:fldSimple w:instr=" SEQ ( \* ARABIC ">
-              <w:r>
-                <w:rPr>
-                  <w:noProof/>
-                </w:rPr>
-                <w:t>7</w:t>
-              </w:r>
-            </w:fldSimple>
+            <w:r>
+              <w:fldChar w:fldCharType="begin"/>
+            </w:r>
+            <w:r>
+              <w:instrText xml:space="preserve"> SEQ ( \* ARABIC </w:instrText>
+            </w:r>
+            <w:r>
+              <w:fldChar w:fldCharType="separate"/>
+            </w:r>
+            <w:r>
+              <w:rPr>
+                <w:noProof/>
+              </w:rPr>
+              <w:t>7</w:t>
+            </w:r>
+            <w:r>
+              <w:rPr>
+                <w:noProof/>
+              </w:rPr>
+              <w:fldChar w:fldCharType="end"/>
+            </w:r>
             <w:r>
               <w:t xml:space="preserve"> )</w:t>
             </w:r>
-            <w:bookmarkEnd w:id="12"/>
+            <w:bookmarkEnd w:id="10"/>
           </w:p>
         </w:tc>
       </w:tr>
@@ -4661,22 +4687,24 @@
           <w:rPr>
             <w:rFonts w:ascii="Cambria Math" w:hAnsi="Cambria Math"/>
           </w:rPr>
-          <m:t>(L → ∞, ε → 0)</m:t>
+          <m:t>(L → ∞, δ → 0)</m:t>
         </m:r>
       </m:oMath>
       <w:r>
-        <w:t xml:space="preserve">, whereas an open formulation attains it directly. For wildfire response, where effective interventions vary continuously with terrain, weather, and available resources, this gap is precisely the advantage of an open decision space, and synthesising interventions over a continuum rather than ranking a fixed menu is what classical </w:t>
-      </w:r>
-      <w:r>
-        <w:t>DSS</w:t>
-      </w:r>
-      <w:r>
-        <w:t xml:space="preserve"> leaves unaddressed.</w:t>
+        <w:t>, whereas an open formulation attains it directly. For wildfire response, where effective interventions vary continuously with terrain, weather, and available resources, this gap is precisely the advantage of an open decision space, and synthesising interventions over a continuum rather than ranking a fixed menu is what classical DSS leaves unaddressed.</w:t>
       </w:r>
     </w:p>
     <w:p>
       <w:pPr>
         <w:pStyle w:val="Heading2"/>
+      </w:pPr>
+      <w:r>
+        <w:t>C. Uncertainty and Partial Observability</w:t>
+      </w:r>
+    </w:p>
+    <w:p>
+      <w:pPr>
+        <w:pStyle w:val="PARAIndent"/>
       </w:pPr>
       <w:r>
         <w:rPr>
@@ -4685,18 +4713,18 @@
         <mc:AlternateContent>
           <mc:Choice Requires="wpg">
             <w:drawing>
-              <wp:anchor distT="0" distB="0" distL="114300" distR="114300" simplePos="0" relativeHeight="251625984" behindDoc="0" locked="0" layoutInCell="1" allowOverlap="1" wp14:anchorId="3B4251C2" wp14:editId="19ABF292">
+              <wp:anchor distT="0" distB="0" distL="114300" distR="114300" simplePos="0" relativeHeight="251662848" behindDoc="0" locked="0" layoutInCell="1" allowOverlap="1" wp14:anchorId="5473CF6E" wp14:editId="0CADEBEC">
                 <wp:simplePos x="0" y="0"/>
                 <wp:positionH relativeFrom="column">
-                  <wp:posOffset>36195</wp:posOffset>
+                  <wp:posOffset>-11282</wp:posOffset>
                 </wp:positionH>
                 <wp:positionV relativeFrom="paragraph">
-                  <wp:posOffset>-6795135</wp:posOffset>
+                  <wp:posOffset>-184101</wp:posOffset>
                 </wp:positionV>
-                <wp:extent cx="3120390" cy="1776730"/>
-                <wp:effectExtent l="0" t="0" r="3810" b="0"/>
+                <wp:extent cx="3217545" cy="2290445"/>
+                <wp:effectExtent l="0" t="0" r="1905" b="0"/>
                 <wp:wrapTopAndBottom/>
-                <wp:docPr id="1009234925" name="Group 3"/>
+                <wp:docPr id="638460422" name="Group 4"/>
                 <wp:cNvGraphicFramePr/>
                 <a:graphic xmlns:a="http://schemas.openxmlformats.org/drawingml/2006/main">
                   <a:graphicData uri="http://schemas.microsoft.com/office/word/2010/wordprocessingGroup">
@@ -4705,29 +4733,35 @@
                       <wpg:grpSpPr>
                         <a:xfrm>
                           <a:off x="0" y="0"/>
-                          <a:ext cx="3120390" cy="1776730"/>
-                          <a:chOff x="-57150" y="45720"/>
-                          <a:chExt cx="3120390" cy="1776730"/>
+                          <a:ext cx="3217545" cy="2290445"/>
+                          <a:chOff x="0" y="-1"/>
+                          <a:chExt cx="3217545" cy="2290494"/>
                         </a:xfrm>
                       </wpg:grpSpPr>
                       <pic:pic xmlns:pic="http://schemas.openxmlformats.org/drawingml/2006/picture">
                         <pic:nvPicPr>
-                          <pic:cNvPr id="703359973" name="Picture 1576516411"/>
+                          <pic:cNvPr id="711833605" name="Picture 3"/>
                           <pic:cNvPicPr>
                             <a:picLocks noChangeAspect="1"/>
                           </pic:cNvPicPr>
                         </pic:nvPicPr>
-                        <pic:blipFill rotWithShape="1">
-                          <a:blip r:embed="rId15"/>
-                          <a:srcRect t="4121" b="5493"/>
+                        <pic:blipFill>
+                          <a:blip r:embed="rId15" cstate="print">
+                            <a:extLst>
+                              <a:ext uri="{28A0092B-C50C-407E-A947-70E740481C1C}">
+                                <a14:useLocalDpi xmlns:a14="http://schemas.microsoft.com/office/drawing/2010/main" val="0"/>
+                              </a:ext>
+                            </a:extLst>
+                          </a:blip>
+                          <a:srcRect/>
                           <a:stretch>
                             <a:fillRect/>
                           </a:stretch>
                         </pic:blipFill>
-                        <pic:spPr>
+                        <pic:spPr bwMode="auto">
                           <a:xfrm>
-                            <a:off x="0" y="45720"/>
-                            <a:ext cx="3063240" cy="1337310"/>
+                            <a:off x="278347" y="-1"/>
+                            <a:ext cx="2680879" cy="2016369"/>
                           </a:xfrm>
                           <a:prstGeom prst="rect">
                             <a:avLst/>
@@ -4735,12 +4769,12 @@
                         </pic:spPr>
                       </pic:pic>
                       <wps:wsp>
-                        <wps:cNvPr id="1971086079" name="Text Box 1"/>
+                        <wps:cNvPr id="2146317878" name="Text Box 1"/>
                         <wps:cNvSpPr txBox="1"/>
                         <wps:spPr>
                           <a:xfrm>
-                            <a:off x="-57150" y="1384300"/>
-                            <a:ext cx="3120390" cy="438150"/>
+                            <a:off x="0" y="1998393"/>
+                            <a:ext cx="3217545" cy="292100"/>
                           </a:xfrm>
                           <a:prstGeom prst="rect">
                             <a:avLst/>
@@ -4758,7 +4792,8 @@
                               <w:pPr>
                                 <w:pStyle w:val="Caption"/>
                               </w:pPr>
-                              <w:bookmarkStart w:id="13" w:name="_Ref232966552"/>
+                              <w:bookmarkStart w:id="11" w:name="_Ref232978231"/>
+                              <w:bookmarkStart w:id="12" w:name="_Ref232978221"/>
                               <w:r>
                                 <w:rPr>
                                   <w:b/>
@@ -4802,7 +4837,7 @@
                                 </w:rPr>
                                 <w:fldChar w:fldCharType="end"/>
                               </w:r>
-                              <w:bookmarkEnd w:id="13"/>
+                              <w:bookmarkEnd w:id="11"/>
                               <w:r>
                                 <w:rPr>
                                   <w:b/>
@@ -4811,10 +4846,10 @@
                                 <w:t>.</w:t>
                               </w:r>
                               <w:r>
-                                <w:t xml:space="preserve"> Closed (finite) decision space versus an open (continuous) decision space.</w:t>
+                                <w:t xml:space="preserve"> Decision making under partial observability (top), the first candidate decision (bottom).</w:t>
                               </w:r>
+                              <w:bookmarkEnd w:id="12"/>
                             </w:p>
-                            <w:p/>
                           </w:txbxContent>
                         </wps:txbx>
                         <wps:bodyPr rot="0" spcFirstLastPara="0" vertOverflow="overflow" horzOverflow="overflow" vert="horz" wrap="square" lIns="0" tIns="0" rIns="0" bIns="0" numCol="1" spcCol="0" rtlCol="0" fromWordArt="0" anchor="t" anchorCtr="0" forceAA="0" compatLnSpc="1">
@@ -4827,9 +4862,6 @@
                     </wpg:wgp>
                   </a:graphicData>
                 </a:graphic>
-                <wp14:sizeRelH relativeFrom="margin">
-                  <wp14:pctWidth>0</wp14:pctWidth>
-                </wp14:sizeRelH>
                 <wp14:sizeRelV relativeFrom="margin">
                   <wp14:pctHeight>0</wp14:pctHeight>
                 </wp14:sizeRelV>
@@ -4838,18 +4870,19 @@
           </mc:Choice>
           <mc:Fallback>
             <w:pict>
-              <v:group w14:anchorId="3B4251C2" id="Group 3" o:spid="_x0000_s1032" style="position:absolute;left:0;text-align:left;margin-left:2.85pt;margin-top:-535.05pt;width:245.7pt;height:139.9pt;z-index:251625984;mso-width-relative:margin;mso-height-relative:margin" coordorigin="-571,457" coordsize="31203,17767" o:gfxdata="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">
-                <v:shape id="Picture 1576516411" o:spid="_x0000_s1033" type="#_x0000_t75" style="position:absolute;top:457;width:30632;height:13373;visibility:visible;mso-wrap-style:square" o:gfxdata="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">
-                  <v:imagedata r:id="rId16" o:title="" croptop="2701f" cropbottom="3600f"/>
+              <v:group w14:anchorId="5473CF6E" id="_x0000_s1032" style="position:absolute;left:0;text-align:left;margin-left:-.9pt;margin-top:-14.5pt;width:253.35pt;height:180.35pt;z-index:251662848;mso-height-relative:margin" coordorigin="" coordsize="32175,22904" o:gfxdata="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">
+                <v:shape id="Picture 3" o:spid="_x0000_s1033" type="#_x0000_t75" style="position:absolute;left:2783;width:26809;height:20163;visibility:visible;mso-wrap-style:square" o:gfxdata="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">
+                  <v:imagedata r:id="rId16" o:title=""/>
                 </v:shape>
-                <v:shape id="_x0000_s1034" type="#_x0000_t202" style="position:absolute;left:-571;top:13843;width:31203;height:4381;visibility:visible;mso-wrap-style:square;v-text-anchor:top" o:gfxdata="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" stroked="f">
+                <v:shape id="_x0000_s1034" type="#_x0000_t202" style="position:absolute;top:19983;width:32175;height:2921;visibility:visible;mso-wrap-style:square;v-text-anchor:top" o:gfxdata="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" stroked="f">
                   <v:textbox style="mso-fit-shape-to-text:t" inset="0,0,0,0">
                     <w:txbxContent>
                       <w:p>
                         <w:pPr>
                           <w:pStyle w:val="Caption"/>
                         </w:pPr>
-                        <w:bookmarkStart w:id="14" w:name="_Ref232966552"/>
+                        <w:bookmarkStart w:id="13" w:name="_Ref232978231"/>
+                        <w:bookmarkStart w:id="14" w:name="_Ref232978221"/>
                         <w:r>
                           <w:rPr>
                             <w:b/>
@@ -4893,7 +4926,7 @@
                           </w:rPr>
                           <w:fldChar w:fldCharType="end"/>
                         </w:r>
-                        <w:bookmarkEnd w:id="14"/>
+                        <w:bookmarkEnd w:id="13"/>
                         <w:r>
                           <w:rPr>
                             <w:b/>
@@ -4902,10 +4935,10 @@
                           <w:t>.</w:t>
                         </w:r>
                         <w:r>
-                          <w:t xml:space="preserve"> Closed (finite) decision space versus an open (continuous) decision space.</w:t>
+                          <w:t xml:space="preserve"> Decision making under partial observability (top), the first candidate decision (bottom).</w:t>
                         </w:r>
+                        <w:bookmarkEnd w:id="14"/>
                       </w:p>
-                      <w:p/>
                     </w:txbxContent>
                   </v:textbox>
                 </v:shape>
@@ -4916,14 +4949,6 @@
         </mc:AlternateContent>
       </w:r>
       <w:r>
-        <w:t>C. Uncertainty and Partial Observability</w:t>
-      </w:r>
-    </w:p>
-    <w:p>
-      <w:pPr>
-        <w:pStyle w:val="PARAIndent"/>
-      </w:pPr>
-      <w:r>
         <w:t xml:space="preserve">A third line of work addresses the uncertainty inherent in incident data. Probabilistic models posit a distribution and reason about expectations, whereas Dempster–Shafer evidence theory </w:t>
       </w:r>
       <w:sdt>
@@ -4953,13 +4978,7 @@
         </w:sdtContent>
       </w:sdt>
       <w:r>
-        <w:t xml:space="preserve"> reasons over masses assigned to subsets of a frame of discernment. Both require prior distributions or calibrated masses, which are seldom available for the epistemic, non-</w:t>
-      </w:r>
-      <w:r>
-        <w:t>statistic</w:t>
-      </w:r>
-      <w:r>
-        <w:t xml:space="preserve"> uncertainty of wildfire sensing </w:t>
+        <w:t xml:space="preserve"> reasons over masses assigned to subsets of a frame of discernment. Both require prior distributions or calibrated masses, which are seldom available for the epistemic, non-statistic uncertainty of wildfire sensing </w:t>
       </w:r>
       <w:sdt>
         <w:sdtPr>
@@ -5020,19 +5039,21 @@
         </w:sdtContent>
       </w:sdt>
       <w:r>
-        <w:t>, in which the true state s ∈ S is hidden and only an observation drawn from a sensing model is available</w:t>
-      </w:r>
-      <w:r>
-        <w:t xml:space="preserve"> </w:t>
+        <w:t xml:space="preserve">, in which the true </w:t>
+      </w:r>
+      <w:proofErr w:type="spellStart"/>
+      <w:r>
+        <w:t>state s</w:t>
+      </w:r>
+      <w:proofErr w:type="spellEnd"/>
+      <w:r>
+        <w:t xml:space="preserve"> ∈ S is hidden and only an observation drawn from a sensing model is available </w:t>
       </w:r>
       <w:r>
         <w:fldChar w:fldCharType="begin"/>
       </w:r>
       <w:r>
-        <w:instrText xml:space="preserve"> REF _Ref232972268 \h </w:instrText>
-      </w:r>
-      <w:r>
-        <w:instrText xml:space="preserve"> \* MERGEFORMAT </w:instrText>
+        <w:instrText xml:space="preserve"> REF _Ref232972268 \h  \* MERGEFORMAT </w:instrText>
       </w:r>
       <w:r>
         <w:fldChar w:fldCharType="separate"/>
@@ -5053,19 +5074,13 @@
         <w:fldChar w:fldCharType="end"/>
       </w:r>
       <w:r>
-        <w:t xml:space="preserve"> </w:t>
-      </w:r>
-      <w:r>
-        <w:t>(</w:t>
+        <w:t xml:space="preserve"> (</w:t>
       </w:r>
       <w:r>
         <w:fldChar w:fldCharType="begin"/>
       </w:r>
       <w:r>
-        <w:instrText xml:space="preserve"> REF _Ref232978231 \h </w:instrText>
-      </w:r>
-      <w:r>
-        <w:instrText xml:space="preserve"> \* MERGEFORMAT </w:instrText>
+        <w:instrText xml:space="preserve"> REF _Ref232978231 \h  \* MERGEFORMAT </w:instrText>
       </w:r>
       <w:r>
         <w:fldChar w:fldCharType="separate"/>
@@ -5077,16 +5092,13 @@
         <w:rPr>
           <w:noProof/>
         </w:rPr>
-        <w:t>2</w:t>
+        <w:t>3</w:t>
       </w:r>
       <w:r>
         <w:fldChar w:fldCharType="end"/>
       </w:r>
       <w:r>
-        <w:t>, top)</w:t>
-      </w:r>
-      <w:r>
-        <w:t>.</w:t>
+        <w:t>, top).</w:t>
       </w:r>
     </w:p>
     <w:tbl>
@@ -5126,7 +5138,16 @@
                   <w:rPr>
                     <w:rFonts w:ascii="Cambria Math" w:hAnsi="Cambria Math"/>
                   </w:rPr>
-                  <m:t>o∼Z(o∣s), s∈S</m:t>
+                  <m:t>o∼Z(o∣s), s∈</m:t>
+                </m:r>
+                <m:r>
+                  <m:rPr>
+                    <m:scr m:val="script"/>
+                  </m:rPr>
+                  <w:rPr>
+                    <w:rFonts w:ascii="Cambria Math" w:hAnsi="Cambria Math"/>
+                  </w:rPr>
+                  <m:t>S</m:t>
                 </m:r>
               </m:oMath>
             </m:oMathPara>
@@ -5146,14 +5167,27 @@
             <w:r>
               <w:t xml:space="preserve">( </w:t>
             </w:r>
-            <w:fldSimple w:instr=" SEQ ( \* ARABIC ">
-              <w:r>
-                <w:rPr>
-                  <w:noProof/>
-                </w:rPr>
-                <w:t>8</w:t>
-              </w:r>
-            </w:fldSimple>
+            <w:r>
+              <w:fldChar w:fldCharType="begin"/>
+            </w:r>
+            <w:r>
+              <w:instrText xml:space="preserve"> SEQ ( \* ARABIC </w:instrText>
+            </w:r>
+            <w:r>
+              <w:fldChar w:fldCharType="separate"/>
+            </w:r>
+            <w:r>
+              <w:rPr>
+                <w:noProof/>
+              </w:rPr>
+              <w:t>8</w:t>
+            </w:r>
+            <w:r>
+              <w:rPr>
+                <w:noProof/>
+              </w:rPr>
+              <w:fldChar w:fldCharType="end"/>
+            </w:r>
             <w:r>
               <w:t xml:space="preserve"> )</w:t>
             </w:r>
@@ -5201,10 +5235,7 @@
         </w:sdtContent>
       </w:sdt>
       <w:r>
-        <w:t>, which accepts a candidate decision as soon as its estimated quality Q meets an adequacy threshold η, as in</w:t>
-      </w:r>
-      <w:r>
-        <w:t xml:space="preserve"> </w:t>
+        <w:t xml:space="preserve">, which accepts a candidate decision as soon as its estimated quality Q meets an adequacy threshold η, as in </w:t>
       </w:r>
       <w:r>
         <w:fldChar w:fldCharType="begin"/>
@@ -5240,10 +5271,7 @@
         <w:fldChar w:fldCharType="begin"/>
       </w:r>
       <w:r>
-        <w:instrText xml:space="preserve"> REF _Ref232978231 \h </w:instrText>
-      </w:r>
-      <w:r>
-        <w:instrText xml:space="preserve"> \* MERGEFORMAT </w:instrText>
+        <w:instrText xml:space="preserve"> REF _Ref232978231 \h  \* MERGEFORMAT </w:instrText>
       </w:r>
       <w:r>
         <w:fldChar w:fldCharType="separate"/>
@@ -5255,16 +5283,13 @@
         <w:rPr>
           <w:noProof/>
         </w:rPr>
-        <w:t>2</w:t>
+        <w:t>3</w:t>
       </w:r>
       <w:r>
         <w:fldChar w:fldCharType="end"/>
       </w:r>
       <w:r>
-        <w:t>, bottom)</w:t>
-      </w:r>
-      <w:r>
-        <w:t>.</w:t>
+        <w:t>, bottom).</w:t>
       </w:r>
     </w:p>
     <w:tbl>
@@ -5330,14 +5355,27 @@
             <w:r>
               <w:t xml:space="preserve">( </w:t>
             </w:r>
-            <w:fldSimple w:instr=" SEQ ( \* ARABIC ">
-              <w:r>
-                <w:rPr>
-                  <w:noProof/>
-                </w:rPr>
-                <w:t>9</w:t>
-              </w:r>
-            </w:fldSimple>
+            <w:r>
+              <w:fldChar w:fldCharType="begin"/>
+            </w:r>
+            <w:r>
+              <w:instrText xml:space="preserve"> SEQ ( \* ARABIC </w:instrText>
+            </w:r>
+            <w:r>
+              <w:fldChar w:fldCharType="separate"/>
+            </w:r>
+            <w:r>
+              <w:rPr>
+                <w:noProof/>
+              </w:rPr>
+              <w:t>9</w:t>
+            </w:r>
+            <w:r>
+              <w:rPr>
+                <w:noProof/>
+              </w:rPr>
+              <w:fldChar w:fldCharType="end"/>
+            </w:r>
             <w:r>
               <w:t xml:space="preserve"> )</w:t>
             </w:r>
@@ -5356,10 +5394,7 @@
         <w:pStyle w:val="PARAIndent"/>
       </w:pPr>
       <w:r>
-        <w:t>Stability of the resulting decisions under perturbed inputs can be characterized by Lipschitz continuity: a mapping f is L-Lipschitz when it satisfies</w:t>
-      </w:r>
-      <w:r>
-        <w:t xml:space="preserve"> </w:t>
+        <w:t xml:space="preserve">Stability of the resulting decisions under perturbed inputs can be characterized by Lipschitz continuity: a mapping f is L-Lipschitz when it satisfies </w:t>
       </w:r>
       <w:r>
         <w:fldChar w:fldCharType="begin"/>
@@ -5446,14 +5481,27 @@
             <w:r>
               <w:t xml:space="preserve">( </w:t>
             </w:r>
-            <w:fldSimple w:instr=" SEQ ( \* ARABIC ">
-              <w:r>
-                <w:rPr>
-                  <w:noProof/>
-                </w:rPr>
-                <w:t>10</w:t>
-              </w:r>
-            </w:fldSimple>
+            <w:r>
+              <w:fldChar w:fldCharType="begin"/>
+            </w:r>
+            <w:r>
+              <w:instrText xml:space="preserve"> SEQ ( \* ARABIC </w:instrText>
+            </w:r>
+            <w:r>
+              <w:fldChar w:fldCharType="separate"/>
+            </w:r>
+            <w:r>
+              <w:rPr>
+                <w:noProof/>
+              </w:rPr>
+              <w:t>10</w:t>
+            </w:r>
+            <w:r>
+              <w:rPr>
+                <w:noProof/>
+              </w:rPr>
+              <w:fldChar w:fldCharType="end"/>
+            </w:r>
             <w:r>
               <w:t xml:space="preserve"> )</w:t>
             </w:r>
@@ -5801,18 +5849,12 @@
         <w:rPr>
           <w:lang w:val="tr-TR"/>
         </w:rPr>
-        <w:instrText xml:space="preserve"> REF _Ref232977215 \h </w:instrText>
+        <w:instrText xml:space="preserve"> REF _Ref232977215 \h  \* MERGEFORMAT </w:instrText>
       </w:r>
       <w:r>
         <w:rPr>
           <w:lang w:val="tr-TR"/>
         </w:rPr>
-      </w:r>
-      <w:r>
-        <w:rPr>
-          <w:lang w:val="tr-TR"/>
-        </w:rPr>
-        <w:instrText xml:space="preserve"> \* MERGEFORMAT </w:instrText>
       </w:r>
       <w:r>
         <w:rPr>
@@ -5856,7 +5898,7 @@
         <mc:AlternateContent>
           <mc:Choice Requires="wpg">
             <w:drawing>
-              <wp:anchor distT="0" distB="0" distL="114300" distR="114300" simplePos="0" relativeHeight="251649536" behindDoc="0" locked="0" layoutInCell="1" allowOverlap="1" wp14:anchorId="582B8107" wp14:editId="4FE49ABB">
+              <wp:anchor distT="0" distB="0" distL="114300" distR="114300" simplePos="0" relativeHeight="251655680" behindDoc="0" locked="0" layoutInCell="1" allowOverlap="1" wp14:anchorId="582B8107" wp14:editId="4FE49ABB">
                 <wp:simplePos x="0" y="0"/>
                 <wp:positionH relativeFrom="column">
                   <wp:posOffset>953</wp:posOffset>
@@ -6014,7 +6056,7 @@
           </mc:Choice>
           <mc:Fallback>
             <w:pict>
-              <v:group w14:anchorId="582B8107" id="ArchFig" o:spid="_x0000_s1035" style="position:absolute;left:0;text-align:left;margin-left:.1pt;margin-top:340.3pt;width:250.45pt;height:126pt;z-index:251649536;mso-position-vertical-relative:margin;mso-width-relative:margin;mso-height-relative:margin" coordorigin="-1524,-702" coordsize="31822,20129" o:gfxdata="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">
+              <v:group w14:anchorId="582B8107" id="ArchFig" o:spid="_x0000_s1035" style="position:absolute;left:0;text-align:left;margin-left:.1pt;margin-top:340.3pt;width:250.45pt;height:126pt;z-index:251655680;mso-position-vertical-relative:margin;mso-width-relative:margin;mso-height-relative:margin" coordorigin="-1524,-702" coordsize="31822,20129" o:gfxdata="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">
                 <v:shape id="_x0000_s1036" type="#_x0000_t202" style="position:absolute;left:-1524;top:12078;width:31822;height:7349;visibility:visible;mso-wrap-style:square;v-text-anchor:top" o:gfxdata="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" stroked="f">
                   <v:textbox style="mso-fit-shape-to-text:t" inset="0,0,0,0">
                     <w:txbxContent>
@@ -6114,8 +6156,11 @@
         <w:pStyle w:val="PARAIndent"/>
       </w:pPr>
       <w:r>
+        <w:rPr>
+          <w:noProof/>
+        </w:rPr>
         <w:drawing>
-          <wp:anchor distT="0" distB="91440" distL="0" distR="0" simplePos="0" relativeHeight="251666944" behindDoc="0" locked="0" layoutInCell="1" allowOverlap="1" wp14:anchorId="651DA77D" wp14:editId="3DAF4C17">
+          <wp:anchor distT="0" distB="91440" distL="0" distR="0" simplePos="0" relativeHeight="251659776" behindDoc="0" locked="0" layoutInCell="1" allowOverlap="1" wp14:anchorId="651DA77D" wp14:editId="3DAF4C17">
             <wp:simplePos x="0" y="0"/>
             <wp:positionH relativeFrom="margin">
               <wp:align>center</wp:align>
@@ -6171,10 +6216,7 @@
         <w:fldChar w:fldCharType="begin"/>
       </w:r>
       <w:r>
-        <w:instrText xml:space="preserve"> REF _Ref233001623 \h </w:instrText>
-      </w:r>
-      <w:r>
-        <w:instrText xml:space="preserve"> \* MERGEFORMAT </w:instrText>
+        <w:instrText xml:space="preserve"> REF _Ref233001623 \h  \* MERGEFORMAT </w:instrText>
       </w:r>
       <w:r>
         <w:fldChar w:fldCharType="separate"/>
@@ -6203,10 +6245,13 @@
         <w:pStyle w:val="PARAIndent"/>
       </w:pPr>
       <w:r>
+        <w:rPr>
+          <w:noProof/>
+        </w:rPr>
         <mc:AlternateContent>
           <mc:Choice Requires="wps">
             <w:drawing>
-              <wp:anchor distT="0" distB="0" distL="114300" distR="114300" simplePos="0" relativeHeight="251692544" behindDoc="0" locked="0" layoutInCell="1" allowOverlap="1" wp14:anchorId="2391C06C" wp14:editId="5E4709C8">
+              <wp:anchor distT="0" distB="0" distL="114300" distR="114300" simplePos="0" relativeHeight="251664896" behindDoc="0" locked="0" layoutInCell="1" allowOverlap="1" wp14:anchorId="2391C06C" wp14:editId="5E4709C8">
                 <wp:simplePos x="0" y="0"/>
                 <wp:positionH relativeFrom="column">
                   <wp:posOffset>-3382327</wp:posOffset>
@@ -6297,10 +6342,7 @@
                               <w:t>.</w:t>
                             </w:r>
                             <w:r>
-                              <w:t xml:space="preserve"> </w:t>
-                            </w:r>
-                            <w:r>
-                              <w:t>Conceptual architecture of the DisasterAware framework: a closed-loop, hierarchically distributed, uncertainty-aware decision pipeline over the spatial wildfire environment.</w:t>
+                              <w:t xml:space="preserve"> Conceptual architecture of the DisasterAware framework: a closed-loop, hierarchically distributed, uncertainty-aware decision pipeline over the spatial wildfire environment.</w:t>
                             </w:r>
                           </w:p>
                           <w:p/>
@@ -6323,7 +6365,7 @@
           </mc:Choice>
           <mc:Fallback>
             <w:pict>
-              <v:shape w14:anchorId="2391C06C" id="Text Box 1" o:spid="_x0000_s1038" type="#_x0000_t202" style="position:absolute;left:0;text-align:left;margin-left:-266.3pt;margin-top:-23.85pt;width:521.3pt;height:34.5pt;z-index:251692544;visibility:visible;mso-wrap-style:square;mso-width-percent:0;mso-wrap-distance-left:9pt;mso-wrap-distance-top:0;mso-wrap-distance-right:9pt;mso-wrap-distance-bottom:0;mso-position-horizontal:absolute;mso-position-horizontal-relative:text;mso-position-vertical:absolute;mso-position-vertical-relative:text;mso-width-percent:0;mso-width-relative:margin;v-text-anchor:top" o:gfxdata="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" stroked="f">
+              <v:shape w14:anchorId="2391C06C" id="Text Box 1" o:spid="_x0000_s1038" type="#_x0000_t202" style="position:absolute;left:0;text-align:left;margin-left:-266.3pt;margin-top:-23.85pt;width:521.3pt;height:34.5pt;z-index:251664896;visibility:visible;mso-wrap-style:square;mso-width-percent:0;mso-wrap-distance-left:9pt;mso-wrap-distance-top:0;mso-wrap-distance-right:9pt;mso-wrap-distance-bottom:0;mso-position-horizontal:absolute;mso-position-horizontal-relative:text;mso-position-vertical:absolute;mso-position-vertical-relative:text;mso-width-percent:0;mso-width-relative:margin;v-text-anchor:top" o:gfxdata="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" stroked="f">
                 <v:textbox style="mso-fit-shape-to-text:t" inset="0,0,0,0">
                   <w:txbxContent>
                     <w:p>
@@ -6383,10 +6425,7 @@
                         <w:t>.</w:t>
                       </w:r>
                       <w:r>
-                        <w:t xml:space="preserve"> </w:t>
-                      </w:r>
-                      <w:r>
-                        <w:t>Conceptual architecture of the DisasterAware framework: a closed-loop, hierarchically distributed, uncertainty-aware decision pipeline over the spatial wildfire environment.</w:t>
+                        <w:t xml:space="preserve"> Conceptual architecture of the DisasterAware framework: a closed-loop, hierarchically distributed, uncertainty-aware decision pipeline over the spatial wildfire environment.</w:t>
                       </w:r>
                     </w:p>
                     <w:p/>
@@ -7146,10 +7185,7 @@
         <w:pStyle w:val="PARAIndent"/>
       </w:pPr>
       <w:r>
-        <w:t>I</w:t>
-      </w:r>
-      <w:r>
-        <w:t xml:space="preserve">ndependent regional decisions may compete for shared and limited resources, they are integrated by the coordination </w:t>
+        <w:t xml:space="preserve">Independent regional decisions may compete for shared and limited resources, they are integrated by the coordination </w:t>
       </w:r>
       <w:proofErr w:type="gramStart"/>
       <w:r>
@@ -7830,27 +7866,14 @@
             <w:r>
               <w:t xml:space="preserve">( </w:t>
             </w:r>
-            <w:r>
-              <w:fldChar w:fldCharType="begin"/>
-            </w:r>
-            <w:r>
-              <w:instrText xml:space="preserve"> SEQ ( \* ARABIC </w:instrText>
-            </w:r>
-            <w:r>
-              <w:fldChar w:fldCharType="separate"/>
-            </w:r>
-            <w:r>
-              <w:rPr>
-                <w:noProof/>
-              </w:rPr>
-              <w:t>15</w:t>
-            </w:r>
-            <w:r>
-              <w:rPr>
-                <w:noProof/>
-              </w:rPr>
-              <w:fldChar w:fldCharType="end"/>
-            </w:r>
+            <w:fldSimple w:instr=" SEQ ( \* ARABIC ">
+              <w:r>
+                <w:rPr>
+                  <w:noProof/>
+                </w:rPr>
+                <w:t>15</w:t>
+              </w:r>
+            </w:fldSimple>
             <w:r>
               <w:t xml:space="preserve"> )</w:t>
             </w:r>
@@ -8039,7 +8062,7 @@
       </w:tblGrid>
       <w:tr>
         <w:trPr>
-          <w:divId w:val="1243367858"/>
+          <w:divId w:val="1574700465"/>
           <w:tblCellSpacing w:w="15" w:type="dxa"/>
         </w:trPr>
         <w:tc>
@@ -8087,7 +8110,7 @@
       </w:tr>
       <w:tr>
         <w:trPr>
-          <w:divId w:val="1243367858"/>
+          <w:divId w:val="1574700465"/>
           <w:tblCellSpacing w:w="15" w:type="dxa"/>
         </w:trPr>
         <w:tc>
@@ -8147,7 +8170,7 @@
       </w:tr>
       <w:tr>
         <w:trPr>
-          <w:divId w:val="1243367858"/>
+          <w:divId w:val="1574700465"/>
           <w:tblCellSpacing w:w="15" w:type="dxa"/>
         </w:trPr>
         <w:tc>
@@ -8207,7 +8230,7 @@
       </w:tr>
       <w:tr>
         <w:trPr>
-          <w:divId w:val="1243367858"/>
+          <w:divId w:val="1574700465"/>
           <w:tblCellSpacing w:w="15" w:type="dxa"/>
         </w:trPr>
         <w:tc>
@@ -8267,7 +8290,7 @@
       </w:tr>
       <w:tr>
         <w:trPr>
-          <w:divId w:val="1243367858"/>
+          <w:divId w:val="1574700465"/>
           <w:tblCellSpacing w:w="15" w:type="dxa"/>
         </w:trPr>
         <w:tc>
@@ -8327,7 +8350,7 @@
       </w:tr>
       <w:tr>
         <w:trPr>
-          <w:divId w:val="1243367858"/>
+          <w:divId w:val="1574700465"/>
           <w:tblCellSpacing w:w="15" w:type="dxa"/>
         </w:trPr>
         <w:tc>
@@ -8373,7 +8396,7 @@
       </w:tr>
       <w:tr>
         <w:trPr>
-          <w:divId w:val="1243367858"/>
+          <w:divId w:val="1574700465"/>
           <w:tblCellSpacing w:w="15" w:type="dxa"/>
         </w:trPr>
         <w:tc>
@@ -8433,7 +8456,7 @@
       </w:tr>
       <w:tr>
         <w:trPr>
-          <w:divId w:val="1243367858"/>
+          <w:divId w:val="1574700465"/>
           <w:tblCellSpacing w:w="15" w:type="dxa"/>
         </w:trPr>
         <w:tc>
@@ -8493,7 +8516,7 @@
       </w:tr>
       <w:tr>
         <w:trPr>
-          <w:divId w:val="1243367858"/>
+          <w:divId w:val="1574700465"/>
           <w:tblCellSpacing w:w="15" w:type="dxa"/>
         </w:trPr>
         <w:tc>
@@ -8539,7 +8562,7 @@
       </w:tr>
       <w:tr>
         <w:trPr>
-          <w:divId w:val="1243367858"/>
+          <w:divId w:val="1574700465"/>
           <w:tblCellSpacing w:w="15" w:type="dxa"/>
         </w:trPr>
         <w:tc>
@@ -8608,7 +8631,7 @@
       </w:tr>
       <w:tr>
         <w:trPr>
-          <w:divId w:val="1243367858"/>
+          <w:divId w:val="1574700465"/>
           <w:tblCellSpacing w:w="15" w:type="dxa"/>
         </w:trPr>
         <w:tc>
@@ -8669,7 +8692,7 @@
       </w:tr>
       <w:tr>
         <w:trPr>
-          <w:divId w:val="1243367858"/>
+          <w:divId w:val="1574700465"/>
           <w:tblCellSpacing w:w="15" w:type="dxa"/>
         </w:trPr>
         <w:tc>
@@ -8729,7 +8752,7 @@
       </w:tr>
       <w:tr>
         <w:trPr>
-          <w:divId w:val="1243367858"/>
+          <w:divId w:val="1574700465"/>
           <w:tblCellSpacing w:w="15" w:type="dxa"/>
         </w:trPr>
         <w:tc>
@@ -8789,7 +8812,7 @@
       </w:tr>
       <w:tr>
         <w:trPr>
-          <w:divId w:val="1243367858"/>
+          <w:divId w:val="1574700465"/>
           <w:tblCellSpacing w:w="15" w:type="dxa"/>
         </w:trPr>
         <w:tc>
@@ -8849,7 +8872,7 @@
       </w:tr>
       <w:tr>
         <w:trPr>
-          <w:divId w:val="1243367858"/>
+          <w:divId w:val="1574700465"/>
           <w:tblCellSpacing w:w="15" w:type="dxa"/>
         </w:trPr>
         <w:tc>
@@ -8909,7 +8932,7 @@
       </w:tr>
       <w:tr>
         <w:trPr>
-          <w:divId w:val="1243367858"/>
+          <w:divId w:val="1574700465"/>
           <w:tblCellSpacing w:w="15" w:type="dxa"/>
         </w:trPr>
         <w:tc>
@@ -8969,7 +8992,7 @@
       </w:tr>
       <w:tr>
         <w:trPr>
-          <w:divId w:val="1243367858"/>
+          <w:divId w:val="1574700465"/>
           <w:tblCellSpacing w:w="15" w:type="dxa"/>
         </w:trPr>
         <w:tc>
@@ -9029,7 +9052,7 @@
       </w:tr>
       <w:tr>
         <w:trPr>
-          <w:divId w:val="1243367858"/>
+          <w:divId w:val="1574700465"/>
           <w:tblCellSpacing w:w="15" w:type="dxa"/>
         </w:trPr>
         <w:tc>
@@ -9089,7 +9112,7 @@
       </w:tr>
       <w:tr>
         <w:trPr>
-          <w:divId w:val="1243367858"/>
+          <w:divId w:val="1574700465"/>
           <w:tblCellSpacing w:w="15" w:type="dxa"/>
         </w:trPr>
         <w:tc>
@@ -9135,7 +9158,7 @@
       </w:tr>
       <w:tr>
         <w:trPr>
-          <w:divId w:val="1243367858"/>
+          <w:divId w:val="1574700465"/>
           <w:tblCellSpacing w:w="15" w:type="dxa"/>
         </w:trPr>
         <w:tc>
@@ -9195,7 +9218,7 @@
       </w:tr>
       <w:tr>
         <w:trPr>
-          <w:divId w:val="1243367858"/>
+          <w:divId w:val="1574700465"/>
           <w:tblCellSpacing w:w="15" w:type="dxa"/>
         </w:trPr>
         <w:tc>
@@ -9255,7 +9278,7 @@
       </w:tr>
       <w:tr>
         <w:trPr>
-          <w:divId w:val="1243367858"/>
+          <w:divId w:val="1574700465"/>
           <w:tblCellSpacing w:w="15" w:type="dxa"/>
         </w:trPr>
         <w:tc>
@@ -9315,7 +9338,7 @@
       </w:tr>
       <w:tr>
         <w:trPr>
-          <w:divId w:val="1243367858"/>
+          <w:divId w:val="1574700465"/>
           <w:tblCellSpacing w:w="15" w:type="dxa"/>
         </w:trPr>
         <w:tc>
@@ -9361,7 +9384,7 @@
       </w:tr>
       <w:tr>
         <w:trPr>
-          <w:divId w:val="1243367858"/>
+          <w:divId w:val="1574700465"/>
           <w:tblCellSpacing w:w="15" w:type="dxa"/>
         </w:trPr>
         <w:tc>
@@ -9421,7 +9444,7 @@
       </w:tr>
       <w:tr>
         <w:trPr>
-          <w:divId w:val="1243367858"/>
+          <w:divId w:val="1574700465"/>
           <w:tblCellSpacing w:w="15" w:type="dxa"/>
         </w:trPr>
         <w:tc>
@@ -9481,7 +9504,7 @@
       </w:tr>
       <w:tr>
         <w:trPr>
-          <w:divId w:val="1243367858"/>
+          <w:divId w:val="1574700465"/>
           <w:tblCellSpacing w:w="15" w:type="dxa"/>
         </w:trPr>
         <w:tc>
@@ -9541,7 +9564,7 @@
       </w:tr>
       <w:tr>
         <w:trPr>
-          <w:divId w:val="1243367858"/>
+          <w:divId w:val="1574700465"/>
           <w:tblCellSpacing w:w="15" w:type="dxa"/>
         </w:trPr>
         <w:tc>
@@ -9607,7 +9630,7 @@
       </w:tr>
       <w:tr>
         <w:trPr>
-          <w:divId w:val="1243367858"/>
+          <w:divId w:val="1574700465"/>
           <w:tblCellSpacing w:w="15" w:type="dxa"/>
         </w:trPr>
         <w:tc>
@@ -9667,7 +9690,7 @@
       </w:tr>
       <w:tr>
         <w:trPr>
-          <w:divId w:val="1243367858"/>
+          <w:divId w:val="1574700465"/>
           <w:tblCellSpacing w:w="15" w:type="dxa"/>
         </w:trPr>
         <w:tc>
@@ -9728,7 +9751,7 @@
     </w:tbl>
     <w:p>
       <w:pPr>
-        <w:divId w:val="1243367858"/>
+        <w:divId w:val="1574700465"/>
         <w:rPr>
           <w:noProof/>
         </w:rPr>
@@ -15049,7 +15072,7 @@
 </file>
 
 <file path=customXml/itemProps1.xml><?xml version="1.0" encoding="utf-8"?>
-<ds:datastoreItem xmlns:ds="http://schemas.openxmlformats.org/officeDocument/2006/customXml" ds:itemID="{4B165DDB-BB4C-4DAF-8EBD-2CE2ECB1931D}">
+<ds:datastoreItem xmlns:ds="http://schemas.openxmlformats.org/officeDocument/2006/customXml" ds:itemID="{CEAA7F9F-263B-4533-B5CF-6CD147B69412}">
   <ds:schemaRefs>
     <ds:schemaRef ds:uri="http://schemas.openxmlformats.org/officeDocument/2006/bibliography"/>
   </ds:schemaRefs>
@@ -15065,7 +15088,7 @@
 </file>
 
 <file path=customXml/itemProps3.xml><?xml version="1.0" encoding="utf-8"?>
-<ds:datastoreItem xmlns:ds="http://schemas.openxmlformats.org/officeDocument/2006/customXml" ds:itemID="{CEAA7F9F-263B-4533-B5CF-6CD147B69412}">
+<ds:datastoreItem xmlns:ds="http://schemas.openxmlformats.org/officeDocument/2006/customXml" ds:itemID="{4B165DDB-BB4C-4DAF-8EBD-2CE2ECB1931D}">
   <ds:schemaRefs>
     <ds:schemaRef ds:uri="http://schemas.openxmlformats.org/officeDocument/2006/bibliography"/>
   </ds:schemaRefs>

</xml_diff>